<commit_message>
docs: relatório v3.1 com a campanha 3 (protocolo v2, vazamento quantificado, ablações)
</commit_message>
<xml_diff>
--- a/docs/RELATORIO-CAMPANHA-1.docx
+++ b/docs/RELATORIO-CAMPANHA-1.docx
@@ -7,7 +7,7 @@
         <w:pStyle w:val="Title"/>
       </w:pPr>
       <w:r>
-        <w:t xml:space="preserve">Geração por LLM de catálogos candidatos de respostas erradas e montagem determinística de grafos de comportamento: estudo exploratório</w:t>
+        <w:t xml:space="preserve">Geração por LLM de catálogos candidatos de respostas erradas: estudo exploratório (v3.1)</w:t>
       </w:r>
     </w:p>
     <w:p>
@@ -23,10 +23,10 @@
         <w:pStyle w:val="BodyText"/>
       </w:pPr>
       <w:r>
-        <w:t xml:space="preserve">Relatório técnico · Estudo exploratório · Experimento OE-A · Versão 3.0</w:t>
-      </w:r>
-    </w:p>
-    <w:bookmarkStart w:id="88" w:name="Xc3776bef04cdc8c08ee8a87d1f4d7a25866b5aa"/>
+        <w:t xml:space="preserve">Relatório técnico · Estudo exploratório · Experimento OE-A · Versão 3.1</w:t>
+      </w:r>
+    </w:p>
+    <w:bookmarkStart w:id="90" w:name="Xc3776bef04cdc8c08ee8a87d1f4d7a25866b5aa"/>
     <w:p>
       <w:pPr>
         <w:pStyle w:val="Heading1"/>
@@ -56,7 +56,7 @@
         <w:pStyle w:val="BodyText"/>
       </w:pPr>
       <w:r>
-        <w:t xml:space="preserve">Versão 3.0, 12 de julho de 2026 (campanhas exploratórias: 2 e 8 a 10 de julho; reanálise: 12 de julho) · Dados e código: github.com/Joaoqueiroz-silva/sti-graph-validation (tag</w:t>
+        <w:t xml:space="preserve">Versão 3.1, 13 de julho de 2026 (campanhas exploratórias: 2, 8 a 10 e 13 de julho; reanálise: 12 de julho) · Dados e código: github.com/Joaoqueiroz-silva/sti-graph-validation (tag</w:t>
       </w:r>
       <w:r>
         <w:t xml:space="preserve"> </w:t>
@@ -105,7 +105,7 @@
         <w:t xml:space="preserve"> </w:t>
       </w:r>
       <w:r>
-        <w:t xml:space="preserve">dependem de grafos de comportamento: estruturas que codificam, por exercício, o caminho de resolução correto, os erros previstos e as remediações. A autoria manual desses grafos é o principal gargalo de escala do paradigma. Este estudo exploratório caracteriza três propriedades dos grafos produzidos por um pipeline que separa geração probabilística (agentes de LLM) de montagem determinística: a integridade estrutural, a cobertura dos valores de respostas erradas registrados no grafo CTAT de referência de um especialista e a plausibilidade, segundo um modelo-juiz, dos erros previstos além desse catálogo. O corpus reúne 24 exercícios de frações na reta numérica derivados de um único template, com um especialista de referência; o sistema autora a partir da interface, sem acesso ao grafo de referência (blindagem parcial, verificada por testes de vazamento). Nenhum dos grafos gerados violou as invariantes estruturais implementadas (72 grafos da campanha e 10.000 em testes de propriedades). A cobertura conceitual média foi de 0,376 (IC95% de 0,309 a 0,442), sem diferença detectável entre quatro famílias de modelos (p ajustado de 0,988 nas três comparações primárias) e crescente com a agregação de execuções (37% em execução única; 64% na união de três). O modelo-juiz classificou 83% dos excedentes como plausíveis, com taxas sensíveis à identidade do juiz. A concordância de classificação de respostas, corrigida pelo acaso, ficou próxima de zero (kappa médio de 0,007), resultado negativo atribuível à bateria autorreferente e que motiva uma bateria independente de traços. A não inferioridade em relação a especialistas não é estimável sem a banda humano-humano; a validade pedagógica dos excedentes e a eficácia educacional permanecem indeterminadas.</w:t>
+        <w:t xml:space="preserve">dependem de grafos de comportamento: estruturas que codificam, por exercício, o caminho de resolução correto, os erros previstos e as remediações. A autoria manual desses grafos é o principal gargalo de escala do paradigma. Este estudo exploratório caracteriza três propriedades dos grafos produzidos por um pipeline que separa geração probabilística (agentes de LLM) de montagem determinística: a integridade estrutural, a cobertura dos valores de respostas erradas registrados no grafo CTAT de referência de um especialista e a plausibilidade, segundo um modelo-juiz, dos erros previstos além desse catálogo. O corpus reúne 24 exercícios de frações na reta numérica derivados de um único template, com um especialista de referência; o sistema autora a partir da interface, sem acesso ao grafo de referência (blindagem parcial, verificada por testes de vazamento). Nenhum dos grafos gerados violou as invariantes estruturais implementadas (72 grafos da campanha e 10.000 em testes de propriedades). A cobertura conceitual média foi de 0,376 (IC95% de 0,309 a 0,442), sem diferença detectável entre quatro famílias de modelos (p ajustado de 0,988 nas três comparações primárias) e crescente com a agregação de execuções (37% em execução única; 64% na união de três). O modelo-juiz classificou 83% dos excedentes como plausíveis, com taxas sensíveis à identidade do juiz. A concordância de classificação de respostas, corrigida pelo acaso, ficou próxima de zero (kappa médio de 0,007), resultado negativo atribuível à bateria autorreferente e que motiva uma bateria independente de traços. Uma terceira campanha, sob protocolo congelado antes da execução e entrada totalmente independente do grafo de referência, estabeleceu a estimativa limpa de cobertura (0,243, IC95% de 0,196 a 0,290), quantificou em cerca de 13 pontos percentuais o vazamento da entrada anterior e identificou o alvo numérico do prompt como o fator dominante do teto (+17,7 pontos ao relaxá-lo, único efeito entre seis ablações que sobrevive à correção de Holm). A não inferioridade em relação a especialistas não é estimável sem a banda humano-humano; a validade pedagógica dos excedentes e a eficácia educacional permanecem indeterminadas.</w:t>
       </w:r>
     </w:p>
     <w:p>
@@ -141,7 +141,7 @@
         <w:t xml:space="preserve"> </w:t>
       </w:r>
       <w:r>
-        <w:t xml:space="preserve">Example-tracing intelligent tutoring systems rely on behavior graphs: per-exercise structures encoding the correct solution path, anticipated errors, and their remediations. Manual authoring of such graphs is the paradigm's main scalability bottleneck. This exploratory study characterizes three properties of graphs produced by a pipeline that separates probabilistic generation (LLM agents) from deterministic assembly: structural integrity, coverage of the wrong-answer values recorded in an expert's reference CTAT graph, and the plausibility, according to a judge model, of errors predicted beyond that catalog. The corpus comprises 24 fraction number-line exercises derived from a single template, with one reference expert; the system authors from the interface without access to the reference graph (partial shielding, verified by leakage tests). No generated graph violated the implemented structural invariants (72 campaign graphs and 10,000 property-tested graphs). Mean conceptual coverage was 0.376 (95% CI 0.309 to 0.442), with no detectable difference across four model families (adjusted p of 0.988 in all three primary comparisons), and increased with run aggregation (37% single run; 64% for the union of three). The judge model classified 83% of the surplus errors as plausible, with rates sensitive to judge identity. Chance-corrected response-classification agreement was near zero (mean kappa 0.007), a negative result attributable to the self-referential battery and motivating an independent trace battery. Non-inferiority to experts is not estimable without a human-to-human band; pedagogical validity of surpluses and educational effectiveness remain undetermined.</w:t>
+        <w:t xml:space="preserve">Example-tracing intelligent tutoring systems rely on behavior graphs: per-exercise structures encoding the correct solution path, anticipated errors, and their remediations. Manual authoring of such graphs is the paradigm's main scalability bottleneck. This exploratory study characterizes three properties of graphs produced by a pipeline that separates probabilistic generation (LLM agents) from deterministic assembly: structural integrity, coverage of the wrong-answer values recorded in an expert's reference CTAT graph, and the plausibility, according to a judge model, of errors predicted beyond that catalog. The corpus comprises 24 fraction number-line exercises derived from a single template, with one reference expert; the system authors from the interface without access to the reference graph (partial shielding, verified by leakage tests). No generated graph violated the implemented structural invariants (72 campaign graphs and 10,000 property-tested graphs). Mean conceptual coverage was 0.376 (95% CI 0.309 to 0.442), with no detectable difference across four model families (adjusted p of 0.988 in all three primary comparisons), and increased with run aggregation (37% single run; 64% for the union of three). The judge model classified 83% of the surplus errors as plausible, with rates sensitive to judge identity. Chance-corrected response-classification agreement was near zero (mean kappa 0.007), a negative result attributable to the self-referential battery and motivating an independent trace battery. A third campaign, under a protocol frozen before execution and with input fully independent of the reference graph, established the clean coverage estimate (0.243, 95% CI 0.196 to 0.290), quantified the previous input leakage at about 13 percentage points, and identified the prompt\u2019s numeric target as the dominant ceiling factor (+17.7 points when relaxed, the only effect among six ablations surviving Holm correction). Non-inferiority to experts is not estimable without a human-to-human band; pedagogical validity of surpluses and educational effectiveness remain undetermined.</w:t>
       </w:r>
     </w:p>
     <w:p>
@@ -724,7 +724,7 @@
     </w:p>
     <w:bookmarkEnd w:id="32"/>
     <w:bookmarkEnd w:id="33"/>
-    <w:bookmarkStart w:id="65" w:name="método"/>
+    <w:bookmarkStart w:id="66" w:name="método"/>
     <w:p>
       <w:pPr>
         <w:pStyle w:val="Heading2"/>
@@ -2536,8 +2536,41 @@
       </w:r>
     </w:p>
     <w:bookmarkEnd w:id="64"/>
+    <w:bookmarkStart w:id="65" w:name="Xa40d9f22a7df27d4b8f1467c025661343b10813"/>
+    <w:p>
+      <w:pPr>
+        <w:pStyle w:val="Heading3"/>
+      </w:pPr>
+      <w:r>
+        <w:t xml:space="preserve">3.11 Campanha 3: protocolo v2 (entrada independente, ablações e painel de juízes)</w:t>
+      </w:r>
+    </w:p>
+    <w:p>
+      <w:pPr>
+        <w:pStyle w:val="FirstParagraph"/>
+      </w:pPr>
+      <w:r>
+        <w:t xml:space="preserve">A terceira campanha (13 de julho) estreia o protocolo v2, congelado integralmente ANTES de qualquer chamada (Emenda 4 do plano de análise): o Envelope A passa a ser construído de fonte independente do grafo de referência (o HTML da interface e o gabarito da tabela de produção em massa do CTAT, com teste metamórfico de independência), os KCs saem da entrada (só existiam dentro do grafo), o esquema neutro v2 representa estados e transições com um executor de example-tracing, e uma bateria congelada de 636 traços em três famílias substitui a bateria autorreferente. Duas consequências declaradas: os enunciados da fonte independente estão em inglês (os arquivos</w:t>
+      </w:r>
+      <w:r>
+        <w:t xml:space="preserve"> </w:t>
+      </w:r>
+      <w:r>
+        <w:rPr>
+          <w:rStyle w:val="VerbatimChar"/>
+        </w:rPr>
+        <w:t xml:space="preserve">.brd</w:t>
+      </w:r>
+      <w:r>
+        <w:t xml:space="preserve"> </w:t>
+      </w:r>
+      <w:r>
+        <w:t xml:space="preserve">traziam tradução), e os níveis absolutos desta campanha NÃO são comparáveis aos das campanhas 1 e 2. A campanha compreende nove condições em três réplicas cada (27 corridas de 24 exercícios, 648 autorias), a curva de ensemble K=1 a 10 e um painel de três famílias de juízes (Mistral Large, Qwen 3.7 Plus e Llama 4 Maverick) julgando o mesmo conjunto congelado de 179 itens. Cada chamada foi registrada em manifesto de execução (modelo, temperatura, hash do prompt e do envelope, tokens, custo e latência), com trava dura de orçamento; o custo total foi de US$ 16,72 em 1.970 chamadas, sem nenhuma falha de autoria em 648 exercícios-execução. A comparação comportamental usa níveis de correspondência declarados por lado (referência no vocabulário exato; lado gerado no nível de equivalência de input por âncora semântica), com passos não ancoráveis contados à parte. A análise foi verificada por recomputação independente em sala limpa, com coincidência bit a bit dos p-valores.</w:t>
+      </w:r>
+    </w:p>
     <w:bookmarkEnd w:id="65"/>
-    <w:bookmarkStart w:id="79" w:name="resultados"/>
+    <w:bookmarkEnd w:id="66"/>
+    <w:bookmarkStart w:id="81" w:name="resultados"/>
     <w:p>
       <w:pPr>
         <w:pStyle w:val="Heading2"/>
@@ -2546,7 +2579,7 @@
         <w:t xml:space="preserve">4 Resultados</w:t>
       </w:r>
     </w:p>
-    <w:bookmarkStart w:id="66" w:name="qp1-integridade-estrutural"/>
+    <w:bookmarkStart w:id="67" w:name="qp1-integridade-estrutural"/>
     <w:p>
       <w:pPr>
         <w:pStyle w:val="Heading3"/>
@@ -2563,8 +2596,8 @@
         <w:t xml:space="preserve">Nenhum dos 72 grafos autorados na avaliação apresentou violação dura ou sinal mole, e o mesmo vale para os 10.000 grafos dos testes de propriedades. A banda histórica do escore de sinais moles resultou degenerada em zero (µ=0, σ=0, n=144), o que estabelece um regime de vigilância estrito: qualquer sinal mole em geração subsequente constitui anomalia. Conclui-se que nenhuma violação das invariantes implementadas foi observada, e a QP1 é respondida afirmativamente PARA as invariantes cobertas; a demonstração de sensibilidade do verificador a defeitos injetados fica para o mutation testing programado (Seção 3.7).</w:t>
       </w:r>
     </w:p>
-    <w:bookmarkEnd w:id="66"/>
-    <w:bookmarkStart w:id="67" w:name="qp2-comparação-com-o-especialista"/>
+    <w:bookmarkEnd w:id="67"/>
+    <w:bookmarkStart w:id="68" w:name="qp2-comparação-com-o-especialista"/>
     <w:p>
       <w:pPr>
         <w:pStyle w:val="Heading3"/>
@@ -3127,8 +3160,8 @@
         <w:t xml:space="preserve">Como verificação de robustez, uma variante simplificada do gerador (os três papéis consolidados em uma única chamada de modelo) foi avaliada em paralelo sob protocolo idêntico. Na reanálise pareada por exercício, os agentes de produção mantêm vantagem clara na completude de passos (Δ=+0,089 [0,055; 0,130], p exato=0,0001) e vantagem sugestiva no F1 estrutural (Δ=+0,050 [0,003; 0,106], p=0,074); na métrica primária, porém, nenhuma diferença foi detectada, com ponto estimado favorável à variante simplificada (Δ=−0,073 [−0,165; 0,031], p=0,17). A arquitetura multiagente, portanto, não demonstra vantagem de cobertura conceitual sobre a chamada única neste corpus; a comparação formal entre arquiteturas integra as ablações planejadas (Seção 7).</w:t>
       </w:r>
     </w:p>
-    <w:bookmarkEnd w:id="67"/>
-    <w:bookmarkStart w:id="68" w:name="caso-ilustrativo"/>
+    <w:bookmarkEnd w:id="68"/>
+    <w:bookmarkStart w:id="69" w:name="caso-ilustrativo"/>
     <w:p>
       <w:pPr>
         <w:pStyle w:val="Heading3"/>
@@ -3518,8 +3551,8 @@
         <w:t xml:space="preserve">A completude conceitual do exercício é 2/3 ≈ 0,67. O excedente 4/4 foi aprovado pelo juiz, enquanto o distrator da mesma rodada (a resposta correta, 3/4) foi rejeitado, como esperado.</w:t>
       </w:r>
     </w:p>
-    <w:bookmarkEnd w:id="68"/>
-    <w:bookmarkStart w:id="69" w:name="análise-por-exercício"/>
+    <w:bookmarkEnd w:id="69"/>
+    <w:bookmarkStart w:id="70" w:name="análise-por-exercício"/>
     <w:p>
       <w:pPr>
         <w:pStyle w:val="Heading3"/>
@@ -3536,8 +3569,8 @@
         <w:t xml:space="preserve">A completude conceitual variou de 0,11 a 0,67 entre os 24 exercícios, com os menores valores concentrados nos exercícios de catálogos maiores e mais específicos (frações impróprias e numeradores elevados). A inspeção das omissões revela um padrão dominante: a resposta composta apenas pelo denominador (o aluno que, solicitado a marcar 3/4, responde 4) consta do catálogo do especialista em quase todos os exercícios e raramente é prevista pelo sistema. Trata-se do diagnóstico mais acionável da campanha: uma classe única de erro, de origem plausivelmente ligada à interpretação do campo de resposta, responde por parcela substancial da lacuna de cobertura. A tabela completa por exercício integra o relatório expandido e o repositório.</w:t>
       </w:r>
     </w:p>
-    <w:bookmarkEnd w:id="69"/>
-    <w:bookmarkStart w:id="70" w:name="Xd31b2b729b87aa2f9744cee4659664856d1bf05"/>
+    <w:bookmarkEnd w:id="70"/>
+    <w:bookmarkStart w:id="71" w:name="Xd31b2b729b87aa2f9744cee4659664856d1bf05"/>
     <w:p>
       <w:pPr>
         <w:pStyle w:val="Heading3"/>
@@ -3916,8 +3949,8 @@
         <w:t xml:space="preserve">Os controles comportaram-se como o desenho exige: a calibração positiva aproximou-se do teto e ambos os distratores foram integralmente rejeitados. Nesse instrumento, 83% dos excedentes do sistema foram classificados como plausíveis PELO MODELO-JUIZ; a sensibilidade ao empate é pequena (81% com empate contado como implausível; 84% como plausível). A diferença em relação à calibração positiva (99%) não foi submetida a teste de equivalência e não se afirma proximidade estatística; a validade pedagógica dos excedentes permanece dependente da anotação humana em curso.</w:t>
       </w:r>
     </w:p>
-    <w:bookmarkEnd w:id="70"/>
-    <w:bookmarkStart w:id="71" w:name="importância-das-omissões"/>
+    <w:bookmarkEnd w:id="71"/>
+    <w:bookmarkStart w:id="72" w:name="importância-das-omissões"/>
     <w:p>
       <w:pPr>
         <w:pStyle w:val="Heading3"/>
@@ -3950,8 +3983,8 @@
         <w:t xml:space="preserve">a Seção 4.9 demonstra que a classificação de centralidade é altamente sensível ao juiz empregado (56% sob GLM-4.5; 97 a 99% sob Mistral), e o nível confiável dessa taxa só será estabelecido pela calibração humana em curso (Seção 3.6). A conclusão qualitativa que sobrevive à sensibilidade é a direcional: uma fração não desprezível das omissões é classificada como central por ambos os juízes; se essa fração é de fato pedagogicamente relevante, só a calibração humana em curso poderá dizer.</w:t>
       </w:r>
     </w:p>
-    <w:bookmarkEnd w:id="71"/>
-    <w:bookmarkStart w:id="75" w:name="síntese-o-veredito-bidimensional"/>
+    <w:bookmarkEnd w:id="72"/>
+    <w:bookmarkStart w:id="76" w:name="síntese-o-veredito-bidimensional"/>
     <w:p>
       <w:pPr>
         <w:pStyle w:val="Heading3"/>
@@ -3977,18 +4010,18 @@
           <wp:inline>
             <wp:extent cx="5334000" cy="2923698"/>
             <wp:effectExtent b="0" l="0" r="0" t="0"/>
-            <wp:docPr descr="Figura 10" title="" id="73" name="Picture"/>
+            <wp:docPr descr="Figura 10" title="" id="74" name="Picture"/>
             <a:graphic>
               <a:graphicData uri="http://schemas.openxmlformats.org/drawingml/2006/picture">
                 <pic:pic>
                   <pic:nvPicPr>
-                    <pic:cNvPr descr="figs/fig10.png" id="74" name="Picture"/>
+                    <pic:cNvPr descr="figs/fig10.png" id="75" name="Picture"/>
                     <pic:cNvPicPr>
                       <a:picLocks noChangeArrowheads="1" noChangeAspect="1"/>
                     </pic:cNvPicPr>
                   </pic:nvPicPr>
                   <pic:blipFill>
-                    <a:blip r:embed="rId72"/>
+                    <a:blip r:embed="rId73"/>
                     <a:stretch>
                       <a:fillRect/>
                     </a:stretch>
@@ -4041,8 +4074,8 @@
         <w:t xml:space="preserve">Quanto à não inferioridade formal: com um único especialista por exercício não existe banda humano-humano, o estimando NÃO É IDENTIFICADO e o teste retorna, desde a reanálise, o veredito "não estimável" (a versão anterior reportava "inconclusivo" com indicador de confiabilidade positivo, defeito apontado em revisão externa e corrigido em código com teste de regressão). Este relatório abstém-se, por desenho, de converter a completude de 0,376 em juízo de inferioridade ou aceitabilidade até que a banda seja coletada e a margem seja justificada por relevância pedagógica, não apenas pela dispersão observada.</w:t>
       </w:r>
     </w:p>
-    <w:bookmarkEnd w:id="75"/>
-    <w:bookmarkStart w:id="76" w:name="campanha-2-repetição-interna-do-baseline"/>
+    <w:bookmarkEnd w:id="76"/>
+    <w:bookmarkStart w:id="77" w:name="campanha-2-repetição-interna-do-baseline"/>
     <w:p>
       <w:pPr>
         <w:pStyle w:val="Heading3"/>
@@ -4059,8 +4092,8 @@
         <w:t xml:space="preserve">A reexecução integral do baseline na campanha 2 (nova infraestrutura, nova data, mesmo protocolo) constitui um teste de repetibilidade interna do experimento. A completude conceitual resultou em 0,368 [0,300; 0,442], contra 0,376 [0,309; 0,442] na campanha 1, com sobreposição quase integral dos intervalos e concordância análoga nas demais métricas. A estimativa foi, portanto, reproduzida internamente, no mesmo corpus e sob condições semelhantes; replicação independente (outra equipe, outro corpus) permanece em aberto.</w:t>
       </w:r>
     </w:p>
-    <w:bookmarkEnd w:id="76"/>
-    <w:bookmarkStart w:id="77" w:name="comparação-entre-modelos-geradores"/>
+    <w:bookmarkEnd w:id="77"/>
+    <w:bookmarkStart w:id="78" w:name="comparação-entre-modelos-geradores"/>
     <w:p>
       <w:pPr>
         <w:pStyle w:val="Heading3"/>
@@ -5531,8 +5564,8 @@
         <w:t xml:space="preserve">Registra-se, ainda, a sensibilidade do instrumento de julgamento: o juiz da campanha 2 (Mistral) mostrou-se sistematicamente mais rígido que o da campanha 1 (GLM-4.5), tanto na calibração positiva (82 a 84%, contra 99%) quanto na classificação de centralidade das omissões (97 a 99%, contra 56%). As comparações entre braços permanecem válidas por compartilharem a régua; níveis absolutos entre campanhas e entre juízes, não. Nenhuma conclusão deste relatório depende de um único juiz para comparação entre braços, mas os NÍVEIS absolutos de plausibilidade devem ser lidos como "segundo o modelo-juiz declarado"; a âncora externa virá da anotação humana em curso (Seção 3.6).</w:t>
       </w:r>
     </w:p>
-    <w:bookmarkEnd w:id="77"/>
-    <w:bookmarkStart w:id="78" w:name="X59870599e6fa6fcbae722220c20f79523ae69b7"/>
+    <w:bookmarkEnd w:id="78"/>
+    <w:bookmarkStart w:id="79" w:name="X59870599e6fa6fcbae722220c20f79523ae69b7"/>
     <w:p>
       <w:pPr>
         <w:pStyle w:val="Heading3"/>
@@ -5984,15 +6017,14 @@
         <w:t xml:space="preserve">).</w:t>
       </w:r>
     </w:p>
-    <w:bookmarkEnd w:id="78"/>
     <w:bookmarkEnd w:id="79"/>
-    <w:bookmarkStart w:id="80" w:name="discussão"/>
-    <w:p>
-      <w:pPr>
-        <w:pStyle w:val="Heading2"/>
-      </w:pPr>
-      <w:r>
-        <w:t xml:space="preserve">5 Discussão</w:t>
+    <w:bookmarkStart w:id="80" w:name="X7e5a29d608242e9eb1cf239be9a8ebd6d307583"/>
+    <w:p>
+      <w:pPr>
+        <w:pStyle w:val="Heading3"/>
+      </w:pPr>
+      <w:r>
+        <w:t xml:space="preserve">4.11 Campanha 3: o vazamento quantificado e o freio do prompt</w:t>
       </w:r>
     </w:p>
     <w:p>
@@ -6000,7 +6032,7 @@
         <w:pStyle w:val="FirstParagraph"/>
       </w:pPr>
       <w:r>
-        <w:t xml:space="preserve">Três leituras emergem dos resultados. Primeira:</w:t>
+        <w:t xml:space="preserve">Sob a entrada independente, a completude conceitual do baseline caiu de 0,376 [0,309; 0,442] para</w:t>
       </w:r>
       <w:r>
         <w:t xml:space="preserve"> </w:t>
@@ -6010,39 +6042,631 @@
           <w:bCs/>
           <w:b/>
         </w:rPr>
-        <w:t xml:space="preserve">a separação entre estrutura e conteúdo funcionou</w:t>
-      </w:r>
-      <w:r>
-        <w:t xml:space="preserve">. Ao confinar a criatividade dos LLMs ao conteúdo pedagógico e delegar a estrutura a um montador determinístico, o pipeline impede as violações cobertas pelas invariantes implementadas, resultado corroborado pelos testes de propriedades e pela campanha (QP1). A implicação prática é imediata: a discussão de qualidade desloca-se integralmente para o plano do conteúdo.</w:t>
-      </w:r>
-    </w:p>
-    <w:p>
-      <w:pPr>
-        <w:pStyle w:val="BodyText"/>
-      </w:pPr>
-      <w:r>
-        <w:t xml:space="preserve">Segunda:</w:t>
-      </w:r>
-      <w:r>
-        <w:t xml:space="preserve"> </w:t>
-      </w:r>
+        <w:t xml:space="preserve">0,243 [0,196; 0,290]</w:t>
+      </w:r>
+      <w:r>
+        <w:t xml:space="preserve">. A anatomia por tipo de erro localiza a diferença: a previsão de frações incorretas não mudou (39% nas duas condições de entrada), enquanto a de valores isolados desabou (numerador de 50% para 24%; outros inteiros de 73% para 0%). A causa é identificável: os KCs da entrada antiga, extraídos das regras de produção do grafo (nomes como</w:t>
+      </w:r>
+      <w:r>
+        <w:t xml:space="preserve"> </w:t>
+      </w:r>
+      <w:r>
+        <w:rPr>
+          <w:rStyle w:val="VerbatimChar"/>
+        </w:rPr>
+        <w:t xml:space="preserve">IdenNumerator</w:t>
+      </w:r>
+      <w:r>
+        <w:t xml:space="preserve"> </w:t>
+      </w:r>
+      <w:r>
+        <w:t xml:space="preserve">e</w:t>
+      </w:r>
+      <w:r>
+        <w:t xml:space="preserve"> </w:t>
+      </w:r>
+      <w:r>
+        <w:rPr>
+          <w:rStyle w:val="VerbatimChar"/>
+        </w:rPr>
+        <w:t xml:space="preserve">IdenDenominator</w:t>
+      </w:r>
+      <w:r>
+        <w:t xml:space="preserve">), sinalizavam a existência de passos de identificação isolada. A diferença de cerca de 13 pontos percentuais é, portanto, a MEDIDA do vazamento de informação que a revisão externa suspeitou: o número antigo estava inflado por pistas derivadas do próprio material de referência, e o novo é a estimativa limpa. A troca do idioma do enunciado (inglês na fonte independente) é um fator concorrente declarado, separável em campanha futura.</w:t>
+      </w:r>
+    </w:p>
+    <w:p>
+      <w:pPr>
+        <w:pStyle w:val="BodyText"/>
+      </w:pPr>
       <w:r>
         <w:rPr>
           <w:bCs/>
           <w:b/>
         </w:rPr>
-        <w:t xml:space="preserve">a maior parte do que o sistema produz é classificada como plausível pelo modelo-juiz, e parte do excedente pode constituir enriquecimento</w:t>
-      </w:r>
-      <w:r>
-        <w:t xml:space="preserve">. A plausibilidade de 83% dos excedentes (itens únicos, juiz cego com controles íntegros) sugere que o sistema não infla o catálogo com ruído óbvio; previu, em diversos exercícios, candidatos ausentes do registro humano. A confirmação de que esses candidatos são pedagogicamente válidos, porém, depende de anotação humana, ainda em curso. Sob a métrica simétrica tradicional, esse enriquecimento teria sido contabilizado como defeito, o que reforça a adequação da função de perda direcional adotada.</w:t>
-      </w:r>
-    </w:p>
-    <w:p>
-      <w:pPr>
-        <w:pStyle w:val="BodyText"/>
-      </w:pPr>
-      <w:r>
-        <w:t xml:space="preserve">Terceira:</w:t>
+        <w:t xml:space="preserve">Tabela 8:</w:t>
+      </w:r>
+      <w:r>
+        <w:t xml:space="preserve"> </w:t>
+      </w:r>
+      <w:r>
+        <w:t xml:space="preserve">campanha 3 (protocolo v2), completude conceitual por condição (média por exercício, IC95%; 3 réplicas; zero falha de autoria). Testes pareados contra o baseline por permutação exata; Holm por família declarada (ablações: m=6).</w:t>
+      </w:r>
+    </w:p>
+    <w:tbl>
+      <w:tblPr>
+        <w:tblStyle w:val="Table"/>
+        <w:tblW w:type="auto" w:w="0"/>
+        <w:tblLook w:firstRow="1" w:lastRow="0" w:firstColumn="0" w:lastColumn="0" w:noHBand="0" w:noVBand="0" w:val="0020"/>
+        <w:jc w:val="start"/>
+      </w:tblPr>
+      <w:tblGrid>
+        <w:gridCol w:w="1980"/>
+        <w:gridCol w:w="1980"/>
+        <w:gridCol w:w="1980"/>
+        <w:gridCol w:w="1980"/>
+      </w:tblGrid>
+      <w:tr>
+        <w:trPr>
+          <w:tblHeader w:val="true"/>
+        </w:trPr>
+        <w:tc>
+          <w:tcPr/>
+          <w:p>
+            <w:pPr>
+              <w:pStyle w:val="Compact"/>
+              <w:jc w:val="left"/>
+            </w:pPr>
+            <w:r>
+              <w:t xml:space="preserve">Condição</w:t>
+            </w:r>
+          </w:p>
+        </w:tc>
+        <w:tc>
+          <w:tcPr/>
+          <w:p>
+            <w:pPr>
+              <w:pStyle w:val="Compact"/>
+              <w:jc w:val="left"/>
+            </w:pPr>
+            <w:r>
+              <w:t xml:space="preserve">Completude conceitual</w:t>
+            </w:r>
+          </w:p>
+        </w:tc>
+        <w:tc>
+          <w:tcPr/>
+          <w:p>
+            <w:pPr>
+              <w:pStyle w:val="Compact"/>
+              <w:jc w:val="left"/>
+            </w:pPr>
+            <w:r>
+              <w:t xml:space="preserve">Δ vs baseline [IC95%]</w:t>
+            </w:r>
+          </w:p>
+        </w:tc>
+        <w:tc>
+          <w:tcPr/>
+          <w:p>
+            <w:pPr>
+              <w:pStyle w:val="Compact"/>
+              <w:jc w:val="left"/>
+            </w:pPr>
+            <w:r>
+              <w:t xml:space="preserve">p-Holm</w:t>
+            </w:r>
+          </w:p>
+        </w:tc>
+      </w:tr>
+      <w:tr>
+        <w:tc>
+          <w:tcPr/>
+          <w:p>
+            <w:pPr>
+              <w:pStyle w:val="Compact"/>
+              <w:jc w:val="left"/>
+            </w:pPr>
+            <w:r>
+              <w:t xml:space="preserve">Baseline (Gemini, envelope independente)</w:t>
+            </w:r>
+          </w:p>
+        </w:tc>
+        <w:tc>
+          <w:tcPr/>
+          <w:p>
+            <w:pPr>
+              <w:pStyle w:val="Compact"/>
+              <w:jc w:val="left"/>
+            </w:pPr>
+            <w:r>
+              <w:t xml:space="preserve">0,243 [0,196; 0,290]</w:t>
+            </w:r>
+          </w:p>
+        </w:tc>
+        <w:tc>
+          <w:tcPr/>
+          <w:p>
+            <w:pPr>
+              <w:pStyle w:val="Compact"/>
+              <w:jc w:val="left"/>
+            </w:pPr>
+            <w:r>
+              <w:t xml:space="preserve">—</w:t>
+            </w:r>
+          </w:p>
+        </w:tc>
+        <w:tc>
+          <w:tcPr/>
+          <w:p>
+            <w:pPr>
+              <w:pStyle w:val="Compact"/>
+              <w:jc w:val="left"/>
+            </w:pPr>
+            <w:r>
+              <w:t xml:space="preserve">—</w:t>
+            </w:r>
+          </w:p>
+        </w:tc>
+      </w:tr>
+      <w:tr>
+        <w:tc>
+          <w:tcPr/>
+          <w:p>
+            <w:pPr>
+              <w:pStyle w:val="Compact"/>
+              <w:jc w:val="left"/>
+            </w:pPr>
+            <w:r>
+              <w:t xml:space="preserve">GLM-5.2</w:t>
+            </w:r>
+          </w:p>
+        </w:tc>
+        <w:tc>
+          <w:tcPr/>
+          <w:p>
+            <w:pPr>
+              <w:pStyle w:val="Compact"/>
+              <w:jc w:val="left"/>
+            </w:pPr>
+            <w:r>
+              <w:t xml:space="preserve">0,178 [0,135; 0,224]</w:t>
+            </w:r>
+          </w:p>
+        </w:tc>
+        <w:tc>
+          <w:tcPr/>
+          <w:p>
+            <w:pPr>
+              <w:pStyle w:val="Compact"/>
+              <w:jc w:val="left"/>
+            </w:pPr>
+            <w:r>
+              <w:t xml:space="preserve">−0,065</w:t>
+            </w:r>
+          </w:p>
+        </w:tc>
+        <w:tc>
+          <w:tcPr/>
+          <w:p>
+            <w:pPr>
+              <w:pStyle w:val="Compact"/>
+              <w:jc w:val="left"/>
+            </w:pPr>
+            <w:r>
+              <w:t xml:space="preserve">n.s.</w:t>
+            </w:r>
+          </w:p>
+        </w:tc>
+      </w:tr>
+      <w:tr>
+        <w:tc>
+          <w:tcPr/>
+          <w:p>
+            <w:pPr>
+              <w:pStyle w:val="Compact"/>
+              <w:jc w:val="left"/>
+            </w:pPr>
+            <w:r>
+              <w:t xml:space="preserve">DeepSeek V4 Pro</w:t>
+            </w:r>
+          </w:p>
+        </w:tc>
+        <w:tc>
+          <w:tcPr/>
+          <w:p>
+            <w:pPr>
+              <w:pStyle w:val="Compact"/>
+              <w:jc w:val="left"/>
+            </w:pPr>
+            <w:r>
+              <w:t xml:space="preserve">0,199 [0,159; 0,240]</w:t>
+            </w:r>
+          </w:p>
+        </w:tc>
+        <w:tc>
+          <w:tcPr/>
+          <w:p>
+            <w:pPr>
+              <w:pStyle w:val="Compact"/>
+              <w:jc w:val="left"/>
+            </w:pPr>
+            <w:r>
+              <w:t xml:space="preserve">−0,044</w:t>
+            </w:r>
+          </w:p>
+        </w:tc>
+        <w:tc>
+          <w:tcPr/>
+          <w:p>
+            <w:pPr>
+              <w:pStyle w:val="Compact"/>
+              <w:jc w:val="left"/>
+            </w:pPr>
+            <w:r>
+              <w:t xml:space="preserve">n.s.</w:t>
+            </w:r>
+          </w:p>
+        </w:tc>
+      </w:tr>
+      <w:tr>
+        <w:tc>
+          <w:tcPr/>
+          <w:p>
+            <w:pPr>
+              <w:pStyle w:val="Compact"/>
+              <w:jc w:val="left"/>
+            </w:pPr>
+            <w:r>
+              <w:rPr>
+                <w:bCs/>
+                <w:b/>
+              </w:rPr>
+              <w:t xml:space="preserve">Limite de 6 candidatos (em vez de 2 a 3)</w:t>
+            </w:r>
+          </w:p>
+        </w:tc>
+        <w:tc>
+          <w:tcPr/>
+          <w:p>
+            <w:pPr>
+              <w:pStyle w:val="Compact"/>
+              <w:jc w:val="left"/>
+            </w:pPr>
+            <w:r>
+              <w:rPr>
+                <w:bCs/>
+                <w:b/>
+              </w:rPr>
+              <w:t xml:space="preserve">0,419 [0,376; 0,462]</w:t>
+            </w:r>
+          </w:p>
+        </w:tc>
+        <w:tc>
+          <w:tcPr/>
+          <w:p>
+            <w:pPr>
+              <w:pStyle w:val="Compact"/>
+              <w:jc w:val="left"/>
+            </w:pPr>
+            <w:r>
+              <w:rPr>
+                <w:bCs/>
+                <w:b/>
+              </w:rPr>
+              <w:t xml:space="preserve">+0,177 [0,123; 0,233]</w:t>
+            </w:r>
+          </w:p>
+        </w:tc>
+        <w:tc>
+          <w:tcPr/>
+          <w:p>
+            <w:pPr>
+              <w:pStyle w:val="Compact"/>
+              <w:jc w:val="left"/>
+            </w:pPr>
+            <w:r>
+              <w:rPr>
+                <w:bCs/>
+                <w:b/>
+              </w:rPr>
+              <w:t xml:space="preserve">2,4×10⁻⁵</w:t>
+            </w:r>
+          </w:p>
+        </w:tc>
+      </w:tr>
+      <w:tr>
+        <w:tc>
+          <w:tcPr/>
+          <w:p>
+            <w:pPr>
+              <w:pStyle w:val="Compact"/>
+              <w:jc w:val="left"/>
+            </w:pPr>
+            <w:r>
+              <w:t xml:space="preserve">Saturação ("liste todas as plausíveis")</w:t>
+            </w:r>
+          </w:p>
+        </w:tc>
+        <w:tc>
+          <w:tcPr/>
+          <w:p>
+            <w:pPr>
+              <w:pStyle w:val="Compact"/>
+              <w:jc w:val="left"/>
+            </w:pPr>
+            <w:r>
+              <w:t xml:space="preserve">0,238 [0,193; 0,283]</w:t>
+            </w:r>
+          </w:p>
+        </w:tc>
+        <w:tc>
+          <w:tcPr/>
+          <w:p>
+            <w:pPr>
+              <w:pStyle w:val="Compact"/>
+              <w:jc w:val="left"/>
+            </w:pPr>
+            <w:r>
+              <w:t xml:space="preserve">−0,005</w:t>
+            </w:r>
+          </w:p>
+        </w:tc>
+        <w:tc>
+          <w:tcPr/>
+          <w:p>
+            <w:pPr>
+              <w:pStyle w:val="Compact"/>
+              <w:jc w:val="left"/>
+            </w:pPr>
+            <w:r>
+              <w:t xml:space="preserve">n.s.</w:t>
+            </w:r>
+          </w:p>
+        </w:tc>
+      </w:tr>
+      <w:tr>
+        <w:tc>
+          <w:tcPr/>
+          <w:p>
+            <w:pPr>
+              <w:pStyle w:val="Compact"/>
+              <w:jc w:val="left"/>
+            </w:pPr>
+            <w:r>
+              <w:t xml:space="preserve">Catálogo interno ligado (MISC_DB)</w:t>
+            </w:r>
+          </w:p>
+        </w:tc>
+        <w:tc>
+          <w:tcPr/>
+          <w:p>
+            <w:pPr>
+              <w:pStyle w:val="Compact"/>
+              <w:jc w:val="left"/>
+            </w:pPr>
+            <w:r>
+              <w:t xml:space="preserve">0,215 [0,171; 0,259]</w:t>
+            </w:r>
+          </w:p>
+        </w:tc>
+        <w:tc>
+          <w:tcPr/>
+          <w:p>
+            <w:pPr>
+              <w:pStyle w:val="Compact"/>
+              <w:jc w:val="left"/>
+            </w:pPr>
+            <w:r>
+              <w:t xml:space="preserve">−0,028</w:t>
+            </w:r>
+          </w:p>
+        </w:tc>
+        <w:tc>
+          <w:tcPr/>
+          <w:p>
+            <w:pPr>
+              <w:pStyle w:val="Compact"/>
+              <w:jc w:val="left"/>
+            </w:pPr>
+            <w:r>
+              <w:t xml:space="preserve">n.s.</w:t>
+            </w:r>
+          </w:p>
+        </w:tc>
+      </w:tr>
+      <w:tr>
+        <w:tc>
+          <w:tcPr/>
+          <w:p>
+            <w:pPr>
+              <w:pStyle w:val="Compact"/>
+              <w:jc w:val="left"/>
+            </w:pPr>
+            <w:r>
+              <w:t xml:space="preserve">Representação DOM</w:t>
+            </w:r>
+          </w:p>
+        </w:tc>
+        <w:tc>
+          <w:tcPr/>
+          <w:p>
+            <w:pPr>
+              <w:pStyle w:val="Compact"/>
+              <w:jc w:val="left"/>
+            </w:pPr>
+            <w:r>
+              <w:t xml:space="preserve">0,207 [0,166; 0,249]</w:t>
+            </w:r>
+          </w:p>
+        </w:tc>
+        <w:tc>
+          <w:tcPr/>
+          <w:p>
+            <w:pPr>
+              <w:pStyle w:val="Compact"/>
+              <w:jc w:val="left"/>
+            </w:pPr>
+            <w:r>
+              <w:t xml:space="preserve">−0,036</w:t>
+            </w:r>
+          </w:p>
+        </w:tc>
+        <w:tc>
+          <w:tcPr/>
+          <w:p>
+            <w:pPr>
+              <w:pStyle w:val="Compact"/>
+              <w:jc w:val="left"/>
+            </w:pPr>
+            <w:r>
+              <w:t xml:space="preserve">n.s.</w:t>
+            </w:r>
+          </w:p>
+        </w:tc>
+      </w:tr>
+      <w:tr>
+        <w:tc>
+          <w:tcPr/>
+          <w:p>
+            <w:pPr>
+              <w:pStyle w:val="Compact"/>
+              <w:jc w:val="left"/>
+            </w:pPr>
+            <w:r>
+              <w:t xml:space="preserve">Representação com screenshot</w:t>
+            </w:r>
+          </w:p>
+        </w:tc>
+        <w:tc>
+          <w:tcPr/>
+          <w:p>
+            <w:pPr>
+              <w:pStyle w:val="Compact"/>
+              <w:jc w:val="left"/>
+            </w:pPr>
+            <w:r>
+              <w:t xml:space="preserve">0,251 [0,204; 0,299]</w:t>
+            </w:r>
+          </w:p>
+        </w:tc>
+        <w:tc>
+          <w:tcPr/>
+          <w:p>
+            <w:pPr>
+              <w:pStyle w:val="Compact"/>
+              <w:jc w:val="left"/>
+            </w:pPr>
+            <w:r>
+              <w:t xml:space="preserve">+0,008</w:t>
+            </w:r>
+          </w:p>
+        </w:tc>
+        <w:tc>
+          <w:tcPr/>
+          <w:p>
+            <w:pPr>
+              <w:pStyle w:val="Compact"/>
+              <w:jc w:val="left"/>
+            </w:pPr>
+            <w:r>
+              <w:t xml:space="preserve">n.s.</w:t>
+            </w:r>
+          </w:p>
+        </w:tc>
+      </w:tr>
+      <w:tr>
+        <w:tc>
+          <w:tcPr/>
+          <w:p>
+            <w:pPr>
+              <w:pStyle w:val="Compact"/>
+              <w:jc w:val="left"/>
+            </w:pPr>
+            <w:r>
+              <w:t xml:space="preserve">Chamada única (sem multiagente)</w:t>
+            </w:r>
+          </w:p>
+        </w:tc>
+        <w:tc>
+          <w:tcPr/>
+          <w:p>
+            <w:pPr>
+              <w:pStyle w:val="Compact"/>
+              <w:jc w:val="left"/>
+            </w:pPr>
+            <w:r>
+              <w:t xml:space="preserve">0,203 [0,163; 0,244]</w:t>
+            </w:r>
+          </w:p>
+        </w:tc>
+        <w:tc>
+          <w:tcPr/>
+          <w:p>
+            <w:pPr>
+              <w:pStyle w:val="Compact"/>
+              <w:jc w:val="left"/>
+            </w:pPr>
+            <w:r>
+              <w:t xml:space="preserve">−0,040</w:t>
+            </w:r>
+          </w:p>
+        </w:tc>
+        <w:tc>
+          <w:tcPr/>
+          <w:p>
+            <w:pPr>
+              <w:pStyle w:val="Compact"/>
+              <w:jc w:val="left"/>
+            </w:pPr>
+            <w:r>
+              <w:t xml:space="preserve">n.s.</w:t>
+            </w:r>
+          </w:p>
+        </w:tc>
+      </w:tr>
+    </w:tbl>
+    <w:p>
+      <w:pPr>
+        <w:pStyle w:val="BodyText"/>
+      </w:pPr>
+      <w:r>
+        <w:t xml:space="preserve">Da família de seis ablações, exatamente UMA sobrevive à correção: elevar o alvo numérico do prompt de 2 a 3 para 6 candidatos quase dobra a cobertura (+17,7 pontos, p-Holm=2,4×10⁻⁵). Três resultados nulos são igualmente informativos. Primeiro, o catálogo interno de misconceptions não contribui nada (e a auditoria da campanha revelou que ele estava efetivamente INERTE nas campanhas anteriores, por um defeito de normalização de acento na chave de disciplina, o que desmonta por evidência a hipótese de que a cobertura viria do catálogo). Segundo, a instrução aberta de saturação ("liste todas") não altera o comportamento: o agente continua produzindo cerca de dois candidatos, enquanto o alvo numérico concreto produz 4,1; para este gerador, instrução quantitativa explícita funciona e instrução aberta não. Terceiro, nem o DOM nem o screenshot da interface moveram a cobertura, o que enfraquece a hipótese de assimetria informacional como explicação do ponto cego pragmático e mantém em aberto a origem do déficit de "denominador isolado".</w:t>
+      </w:r>
+    </w:p>
+    <w:p>
+      <w:pPr>
+        <w:pStyle w:val="BodyText"/>
+      </w:pPr>
+      <w:r>
+        <w:t xml:space="preserve">A curva de ensemble sobre o envelope independente reproduz o mecanismo de amostragem: 24% em K=1, 35% em K=3, 42% em K=6 e 47% em K=10, ainda crescente. Combinada ao efeito do limite (0,42 com uma única execução de alvo 6), a engenharia de recuperação de cobertura fica quantificada em duas alavancas independentes e baratas. As métricas comportamentais (bateria congelada, executor de traços) confirmaram o quadro entre braços (nenhuma diferença entre famílias de modelo; p-Holm≥0,44) e expuseram com honestidade a distância de granularidade entre o grafo gerado e o de referência: no nível de correspondência declarado, o reconhecimento de erros em contexto fica em 0,06 e nenhum traço correto completo da referência é aceito passo a passo, anatomia registrada item a item nos relatórios.</w:t>
+      </w:r>
+    </w:p>
+    <w:p>
+      <w:pPr>
+        <w:pStyle w:val="BodyText"/>
+      </w:pPr>
+      <w:r>
+        <w:t xml:space="preserve">O painel de três juízes sobre os mesmos 179 itens congelados entregou concordância entre famílias de substancial a moderada: κ de 0,72 (Mistral×Qwen), 0,70 (Mistral×Llama) e 0,55 (Qwen×Llama), com zero itens sem veredito. Nenhuma conclusão de julgamento desta campanha depende de um único juiz; a calibração humana (anotação em curso) dirá qual família julga mais próximo de uma pessoa.</w:t>
+      </w:r>
+    </w:p>
+    <w:bookmarkEnd w:id="80"/>
+    <w:bookmarkEnd w:id="81"/>
+    <w:bookmarkStart w:id="82" w:name="discussão"/>
+    <w:p>
+      <w:pPr>
+        <w:pStyle w:val="Heading2"/>
+      </w:pPr>
+      <w:r>
+        <w:t xml:space="preserve">5 Discussão</w:t>
+      </w:r>
+    </w:p>
+    <w:p>
+      <w:pPr>
+        <w:pStyle w:val="FirstParagraph"/>
+      </w:pPr>
+      <w:r>
+        <w:t xml:space="preserve">Três leituras emergem dos resultados. Primeira:</w:t>
       </w:r>
       <w:r>
         <w:t xml:space="preserve"> </w:t>
@@ -6052,18 +6676,18 @@
           <w:bCs/>
           <w:b/>
         </w:rPr>
-        <w:t xml:space="preserve">a lacuna de cobertura é real e diagnosticável</w:t>
-      </w:r>
-      <w:r>
-        <w:t xml:space="preserve">. A completude de 0,376, combinada à classificação preliminar de 56% das omissões como centrais (estimativa altamente sensível ao juiz; Seção 4.9), desaconselha a leitura de complementaridade inócua. O padrão do denominador isolado (Seção 4.4) sugere que parcela substancial da lacuna provém de uma classe específica e endereçável de erro, ligada à interpretação pragmática do campo de resposta, dimensão em que a experiência de sala de aula do especialista excede a simulação atual. A lacuna, contudo, ainda carece de régua: sem a banda interespecialistas, não se sabe que fração do catálogo um segundo humano cobriria.</w:t>
-      </w:r>
-    </w:p>
-    <w:p>
-      <w:pPr>
-        <w:pStyle w:val="BodyText"/>
-      </w:pPr>
-      <w:r>
-        <w:t xml:space="preserve">A campanha 2 acrescenta uma quarta leitura:</w:t>
+        <w:t xml:space="preserve">a separação entre estrutura e conteúdo funcionou</w:t>
+      </w:r>
+      <w:r>
+        <w:t xml:space="preserve">. Ao confinar a criatividade dos LLMs ao conteúdo pedagógico e delegar a estrutura a um montador determinístico, o pipeline impede as violações cobertas pelas invariantes implementadas, resultado corroborado pelos testes de propriedades e pela campanha (QP1). A implicação prática é imediata: a discussão de qualidade desloca-se integralmente para o plano do conteúdo.</w:t>
+      </w:r>
+    </w:p>
+    <w:p>
+      <w:pPr>
+        <w:pStyle w:val="BodyText"/>
+      </w:pPr>
+      <w:r>
+        <w:t xml:space="preserve">Segunda:</w:t>
       </w:r>
       <w:r>
         <w:t xml:space="preserve"> </w:t>
@@ -6073,94 +6697,108 @@
           <w:bCs/>
           <w:b/>
         </w:rPr>
-        <w:t xml:space="preserve">os resultados são compatíveis com a hipótese de que o teto de cobertura pertence ao procedimento, não ao modelo</w:t>
-      </w:r>
-      <w:r>
-        <w:t xml:space="preserve">, sem que isso estabeleça equivalência entre modelos (Seção 4.9). Quatro famílias independentes de LLM, incluindo dois modelos de maior porte, produziram completudes na mesma faixa, nenhuma diferença primária foi detectada, e o único contraste que sobrevive à correção (a completude de passos do DeepSeek) não toca a métrica primária. Duas explicações alternativas para a convergência permanecem em aberto e são alvo de ablação: o catálogo interno e o limite de candidatos do prompt, comuns aos quatro braços, podem induzir convergência artificial. Combinada à evidência de agregação (37% para 64% com três execuções) e à anatomia da lacuna, a comparação multimodelo sugere, como decisão de engenharia provisória, manter o modelo mais eficiente e atacar a cobertura por agregação de execuções e pelo enriquecimento dirigido da geração, não por troca de modelo.</w:t>
-      </w:r>
-    </w:p>
-    <w:p>
-      <w:pPr>
-        <w:pStyle w:val="BodyText"/>
-      </w:pPr>
-      <w:r>
-        <w:t xml:space="preserve">Cabe ainda registrar uma lição metodológica: parcela expressiva do déficit inicialmente aferido decorreu de artefatos de medição (grafias distintas do mesmo valor, erros mecânicos contabilizados como conceituais, divergência de âncora entre módulos), corrigidos ao longo das revisões adversariais sem qualquer alteração nos agentes. Em avaliação de sistemas generativos, o refinamento do instrumento precede legitimamente o refinamento do sistema.</w:t>
-      </w:r>
-    </w:p>
-    <w:bookmarkEnd w:id="80"/>
-    <w:bookmarkStart w:id="81" w:name="ameaças-à-validade-e-limitações"/>
-    <w:p>
-      <w:pPr>
-        <w:pStyle w:val="Heading2"/>
-      </w:pPr>
-      <w:r>
-        <w:t xml:space="preserve">6 Ameaças à validade e limitações</w:t>
-      </w:r>
-    </w:p>
-    <w:p>
-      <w:pPr>
-        <w:pStyle w:val="FirstParagraph"/>
-      </w:pPr>
+        <w:t xml:space="preserve">a maior parte do que o sistema produz é classificada como plausível pelo modelo-juiz, e parte do excedente pode constituir enriquecimento</w:t>
+      </w:r>
+      <w:r>
+        <w:t xml:space="preserve">. A plausibilidade de 83% dos excedentes (itens únicos, juiz cego com controles íntegros) sugere que o sistema não infla o catálogo com ruído óbvio; previu, em diversos exercícios, candidatos ausentes do registro humano. A confirmação de que esses candidatos são pedagogicamente válidos, porém, depende de anotação humana, ainda em curso. Sob a métrica simétrica tradicional, esse enriquecimento teria sido contabilizado como defeito, o que reforça a adequação da função de perda direcional adotada.</w:t>
+      </w:r>
+    </w:p>
+    <w:p>
+      <w:pPr>
+        <w:pStyle w:val="BodyText"/>
+      </w:pPr>
+      <w:r>
+        <w:t xml:space="preserve">Terceira:</w:t>
+      </w:r>
+      <w:r>
+        <w:t xml:space="preserve"> </w:t>
+      </w:r>
       <w:r>
         <w:rPr>
           <w:bCs/>
           <w:b/>
         </w:rPr>
-        <w:t xml:space="preserve">Validade de construto.</w:t>
-      </w:r>
-      <w:r>
-        <w:t xml:space="preserve"> </w:t>
-      </w:r>
-      <w:r>
-        <w:t xml:space="preserve">A operacionalização de misconception como VALOR canônico de resposta errada mede coincidência de valores, não de raciocínios: raciocínios distintos podem produzir o mesmo valor, a mesma regra cognitiva produz valores diferentes em exercícios diferentes, e o valor final não informa o passo nem a estratégia. A leitura correta da métrica primária é "cobertura de valores de respostas erradas do catálogo de referência". A representação por regra, passo e trajetória, com codificação humana às cegas, integra a agenda futura. A completude depende ainda do casamento por âncora semântica; formas de resposta não previstas pela canonicalização podem gerar falsos negativos. A anotação humana em curso e os testes de regressão da âncora mitigam, sem eliminar, o risco. Uma análise de sensibilidade quantifica o efeito do refinamento semântico: recomputando a completude conceitual com a âncora crua (sem redução de frações equivalentes), a média move-se de 0,376 para 0,347 (Δ=0,029; cálculo integrado ao script gerador, entrada "sensibilidade da âncora" em</w:t>
-      </w:r>
-      <w:r>
-        <w:t xml:space="preserve"> </w:t>
-      </w:r>
-      <w:r>
-        <w:rPr>
-          <w:rStyle w:val="VerbatimChar"/>
-        </w:rPr>
-        <w:t xml:space="preserve">analysis/derived/TABELAS.md</w:t>
-      </w:r>
-      <w:r>
-        <w:t xml:space="preserve">), indicando que o resultado principal não é artefato do refinamento; a validação em conjunto verdadeiramente reservado permanece dependente do segundo template (Seção 7). O juiz de plausibilidade é um LLM: apesar do cegamento, da família distinta e dos controles por rodada, sua calibração definitiva contra julgamento humano (kappa) permanece em execução.</w:t>
-      </w:r>
-    </w:p>
-    <w:p>
-      <w:pPr>
-        <w:pStyle w:val="BodyText"/>
-      </w:pPr>
+        <w:t xml:space="preserve">a lacuna de cobertura é real e diagnosticável</w:t>
+      </w:r>
+      <w:r>
+        <w:t xml:space="preserve">. A completude de 0,376, combinada à classificação preliminar de 56% das omissões como centrais (estimativa altamente sensível ao juiz; Seção 4.9), desaconselha a leitura de complementaridade inócua. O padrão do denominador isolado (Seção 4.4) sugere que parcela substancial da lacuna provém de uma classe específica e endereçável de erro, ligada à interpretação pragmática do campo de resposta, dimensão em que a experiência de sala de aula do especialista excede a simulação atual. A lacuna, contudo, ainda carece de régua: sem a banda interespecialistas, não se sabe que fração do catálogo um segundo humano cobriria.</w:t>
+      </w:r>
+    </w:p>
+    <w:p>
+      <w:pPr>
+        <w:pStyle w:val="BodyText"/>
+      </w:pPr>
+      <w:r>
+        <w:t xml:space="preserve">A campanha 2 acrescenta uma quarta leitura:</w:t>
+      </w:r>
+      <w:r>
+        <w:t xml:space="preserve"> </w:t>
+      </w:r>
       <w:r>
         <w:rPr>
           <w:bCs/>
           <w:b/>
         </w:rPr>
-        <w:t xml:space="preserve">Validade interna.</w:t>
-      </w:r>
-      <w:r>
-        <w:t xml:space="preserve"> </w:t>
-      </w:r>
-      <w:r>
-        <w:t xml:space="preserve">O protocolo de envelopes é verificado mecanicamente e o teste de vazamento inclui controle negativo, mas a blindagem é PARCIAL: o Envelope A deriva do mesmo arquivo que contém o grafo de referência e o teste é lexical (Seção 3.3). Há ainda assimetria informacional entre as condições: o autor da referência via a interface real, enquanto os agentes recebem uma serialização textual dela, o que pode explicar parte do ponto cego pragmático (Seção 4.10). A resposta correta no Envelope A é decisão declarada de desenho. As réplicas e os intervalos reportados absorvem a estocasticidade dos agentes; falhas de chamada e acionamentos de contingência não foram registrados por corrida nas campanhas atuais, lacuna de manifesto que a próxima campanha corrige.</w:t>
-      </w:r>
-    </w:p>
-    <w:p>
-      <w:pPr>
-        <w:pStyle w:val="BodyText"/>
+        <w:t xml:space="preserve">os resultados são compatíveis com a hipótese de que o teto de cobertura pertence ao procedimento, não ao modelo</w:t>
+      </w:r>
+      <w:r>
+        <w:t xml:space="preserve">, sem que isso estabeleça equivalência entre modelos (Seção 4.9). Quatro famílias independentes de LLM, incluindo dois modelos de maior porte, produziram completudes na mesma faixa, nenhuma diferença primária foi detectada, e o único contraste que sobrevive à correção (a completude de passos do DeepSeek) não toca a métrica primária. Duas explicações alternativas para a convergência permanecem em aberto e são alvo de ablação: o catálogo interno e o limite de candidatos do prompt, comuns aos quatro braços, podem induzir convergência artificial. Combinada à evidência de agregação (37% para 64% com três execuções) e à anatomia da lacuna, a comparação multimodelo sugere, como decisão de engenharia provisória, manter o modelo mais eficiente e atacar a cobertura por agregação de execuções e pelo enriquecimento dirigido da geração, não por troca de modelo.</w:t>
+      </w:r>
+    </w:p>
+    <w:p>
+      <w:pPr>
+        <w:pStyle w:val="BodyText"/>
+      </w:pPr>
+      <w:r>
+        <w:t xml:space="preserve">A campanha 3 fecha o ciclo aberto pela revisão externa com três respostas empíricas. A suspeita de vazamento era procedente e agora está QUANTIFICADA (cerca de 13 pontos percentuais de cobertura vinham de pistas derivadas do grafo, sobretudo os nomes de KCs); a suspeita de dependência do catálogo interno está refutada por ablação (efeito nulo, além da descoberta de que o catálogo estava inerte); e o teto de cobertura tem agora um mecanismo dominante identificado e acionável, o alvo numérico do prompt, cujo relaxamento para seis candidatos quase dobra a cobertura com uma única execução. A hipótese visual (o modelo não vê a interface) NÃO se sustentou nesta interface: screenshot e DOM não moveram a métrica. O caminho de engenharia que emerge é barato e mensurável: alvo numérico maior, agregação de poucas execuções e julgamento automatizado com painel, tudo sob revisão humana.</w:t>
+      </w:r>
+    </w:p>
+    <w:p>
+      <w:pPr>
+        <w:pStyle w:val="BodyText"/>
+      </w:pPr>
+      <w:r>
+        <w:t xml:space="preserve">Cabe ainda registrar uma lição metodológica: parcela expressiva do déficit inicialmente aferido decorreu de artefatos de medição (grafias distintas do mesmo valor, erros mecânicos contabilizados como conceituais, divergência de âncora entre módulos), corrigidos ao longo das revisões adversariais sem qualquer alteração nos agentes. Em avaliação de sistemas generativos, o refinamento do instrumento precede legitimamente o refinamento do sistema.</w:t>
+      </w:r>
+    </w:p>
+    <w:bookmarkEnd w:id="82"/>
+    <w:bookmarkStart w:id="83" w:name="ameaças-à-validade-e-limitações"/>
+    <w:p>
+      <w:pPr>
+        <w:pStyle w:val="Heading2"/>
+      </w:pPr>
+      <w:r>
+        <w:t xml:space="preserve">6 Ameaças à validade e limitações</w:t>
+      </w:r>
+    </w:p>
+    <w:p>
+      <w:pPr>
+        <w:pStyle w:val="FirstParagraph"/>
       </w:pPr>
       <w:r>
         <w:rPr>
           <w:bCs/>
           <w:b/>
         </w:rPr>
-        <w:t xml:space="preserve">Validade externa.</w:t>
-      </w:r>
-      <w:r>
-        <w:t xml:space="preserve"> </w:t>
-      </w:r>
-      <w:r>
-        <w:t xml:space="preserve">O corpus restringe-se a um domínio (frações na reta numérica), um ÚNICO template de interface, uma faixa etária, um idioma e um autor de referência, em 24 exercícios. Para generalização entre interfaces, o suporte efetivo aproxima-se de N=1: variações do mesmo template não criam diversidade de interface. Toda conclusão deste relatório vale para os exercícios e o template estudados; a extensão a outros domínios, interfaces e populações requer replicação com novos corpora e novos especialistas; o pacote publicado facilita a reexecução do protocolo. Os resultados quantitativos aplicam-se aos modelos e versões da Tabela 1.</w:t>
+        <w:t xml:space="preserve">Validade de construto.</w:t>
+      </w:r>
+      <w:r>
+        <w:t xml:space="preserve"> </w:t>
+      </w:r>
+      <w:r>
+        <w:t xml:space="preserve">A operacionalização de misconception como VALOR canônico de resposta errada mede coincidência de valores, não de raciocínios: raciocínios distintos podem produzir o mesmo valor, a mesma regra cognitiva produz valores diferentes em exercícios diferentes, e o valor final não informa o passo nem a estratégia. A leitura correta da métrica primária é "cobertura de valores de respostas erradas do catálogo de referência". A representação por regra, passo e trajetória, com codificação humana às cegas, integra a agenda futura. A completude depende ainda do casamento por âncora semântica; formas de resposta não previstas pela canonicalização podem gerar falsos negativos. A anotação humana em curso e os testes de regressão da âncora mitigam, sem eliminar, o risco. Uma análise de sensibilidade quantifica o efeito do refinamento semântico: recomputando a completude conceitual com a âncora crua (sem redução de frações equivalentes), a média move-se de 0,376 para 0,347 (Δ=0,029; cálculo integrado ao script gerador, entrada "sensibilidade da âncora" em</w:t>
+      </w:r>
+      <w:r>
+        <w:t xml:space="preserve"> </w:t>
+      </w:r>
+      <w:r>
+        <w:rPr>
+          <w:rStyle w:val="VerbatimChar"/>
+        </w:rPr>
+        <w:t xml:space="preserve">analysis/derived/TABELAS.md</w:t>
+      </w:r>
+      <w:r>
+        <w:t xml:space="preserve">), indicando que o resultado principal não é artefato do refinamento; a validação em conjunto verdadeiramente reservado permanece dependente do segundo template (Seção 7). O juiz de plausibilidade é um LLM: apesar do cegamento, da família distinta e dos controles por rodada, sua calibração definitiva contra julgamento humano (kappa) permanece em execução.</w:t>
       </w:r>
     </w:p>
     <w:p>
@@ -6172,13 +6810,13 @@
           <w:bCs/>
           <w:b/>
         </w:rPr>
-        <w:t xml:space="preserve">Comparabilidade entre juízes.</w:t>
-      </w:r>
-      <w:r>
-        <w:t xml:space="preserve"> </w:t>
-      </w:r>
-      <w:r>
-        <w:t xml:space="preserve">Os níveis absolutos de julgamento diferem entre os juízes das duas campanhas (GLM-4.5 e Mistral Large), como documentado na Seção 4.9; nenhuma conclusão deste relatório compara níveis absolutos entre campanhas, e a calibração humana em curso fornecerá a âncora externa.</w:t>
+        <w:t xml:space="preserve">Validade interna.</w:t>
+      </w:r>
+      <w:r>
+        <w:t xml:space="preserve"> </w:t>
+      </w:r>
+      <w:r>
+        <w:t xml:space="preserve">O protocolo de envelopes é verificado mecanicamente e o teste de vazamento inclui controle negativo, mas a blindagem é PARCIAL: o Envelope A deriva do mesmo arquivo que contém o grafo de referência e o teste é lexical (Seção 3.3). Há ainda assimetria informacional entre as condições: o autor da referência via a interface real, enquanto os agentes recebem uma serialização textual dela, o que pode explicar parte do ponto cego pragmático (Seção 4.10). A resposta correta no Envelope A é decisão declarada de desenho. As réplicas e os intervalos reportados absorvem a estocasticidade dos agentes; falhas de chamada e acionamentos de contingência não foram registrados por corrida nas campanhas atuais, lacuna de manifesto que a próxima campanha corrige.</w:t>
       </w:r>
     </w:p>
     <w:p>
@@ -6190,6 +6828,42 @@
           <w:bCs/>
           <w:b/>
         </w:rPr>
+        <w:t xml:space="preserve">Validade externa.</w:t>
+      </w:r>
+      <w:r>
+        <w:t xml:space="preserve"> </w:t>
+      </w:r>
+      <w:r>
+        <w:t xml:space="preserve">O corpus restringe-se a um domínio (frações na reta numérica), um ÚNICO template de interface, uma faixa etária, um idioma e um autor de referência, em 24 exercícios. Para generalização entre interfaces, o suporte efetivo aproxima-se de N=1: variações do mesmo template não criam diversidade de interface. Toda conclusão deste relatório vale para os exercícios e o template estudados; a extensão a outros domínios, interfaces e populações requer replicação com novos corpora e novos especialistas; o pacote publicado facilita a reexecução do protocolo. Os resultados quantitativos aplicam-se aos modelos e versões da Tabela 1.</w:t>
+      </w:r>
+    </w:p>
+    <w:p>
+      <w:pPr>
+        <w:pStyle w:val="BodyText"/>
+      </w:pPr>
+      <w:r>
+        <w:rPr>
+          <w:bCs/>
+          <w:b/>
+        </w:rPr>
+        <w:t xml:space="preserve">Comparabilidade entre juízes.</w:t>
+      </w:r>
+      <w:r>
+        <w:t xml:space="preserve"> </w:t>
+      </w:r>
+      <w:r>
+        <w:t xml:space="preserve">Os níveis absolutos de julgamento diferem entre os juízes das duas campanhas (GLM-4.5 e Mistral Large), como documentado na Seção 4.9; nenhuma conclusão deste relatório compara níveis absolutos entre campanhas, e a calibração humana em curso fornecerá a âncora externa.</w:t>
+      </w:r>
+    </w:p>
+    <w:p>
+      <w:pPr>
+        <w:pStyle w:val="BodyText"/>
+      </w:pPr>
+      <w:r>
+        <w:rPr>
+          <w:bCs/>
+          <w:b/>
+        </w:rPr>
         <w:t xml:space="preserve">Validade de conclusão estatística.</w:t>
       </w:r>
       <w:r>
@@ -6199,8 +6873,8 @@
         <w:t xml:space="preserve">Com um especialista por exercício, a não inferioridade não é estimável, e assim é reportada. As comparações pareadas usam o exercício como unidade, permutação exata por troca de sinais e Holm por família declarada (Emenda 3 do plano de análise); as afirmações de significância refletem exclusivamente os valores desta reanálise. Ausência de significância não é evidência de equivalência; nenhuma alegação de equivalência é feita.</w:t>
       </w:r>
     </w:p>
-    <w:bookmarkEnd w:id="81"/>
-    <w:bookmarkStart w:id="82" w:name="trabalhos-futuros"/>
+    <w:bookmarkEnd w:id="83"/>
+    <w:bookmarkStart w:id="84" w:name="trabalhos-futuros"/>
     <w:p>
       <w:pPr>
         <w:pStyle w:val="Heading2"/>
@@ -6341,8 +7015,8 @@
         <w:t xml:space="preserve">avaliação de eficácia com alunos reais (curvas de aprendizagem sob AFM; Cen; Koedinger; Junker, 2006), fora do escopo da presente campanha.</w:t>
       </w:r>
     </w:p>
-    <w:bookmarkEnd w:id="82"/>
-    <w:bookmarkStart w:id="83" w:name="conclusão"/>
+    <w:bookmarkEnd w:id="84"/>
+    <w:bookmarkStart w:id="85" w:name="conclusão"/>
     <w:p>
       <w:pPr>
         <w:pStyle w:val="Heading2"/>
@@ -6364,11 +7038,11 @@
         <w:pStyle w:val="BodyText"/>
       </w:pPr>
       <w:r>
-        <w:t xml:space="preserve">O que este estudo NÃO estabelece, por desenho: a qualidade do grafo completo (dicas, remediações e múltiplos caminhos não são comparados), a equivalência funcional entre tutores, a não inferioridade em relação a especialistas (não estimável sem banda humano-humano), a validade pedagógica dos excedentes e qualquer efeito sobre aprendizagem. Esses níveis exigem, respectivamente, a comparação baseada em traços sobre o esquema ampliado, a bateria independente, a coleta com múltiplos especialistas, a anotação humana e o estudo com estudantes, todos especificados como fases futuras. Os resultados atuais são compatíveis, no domínio e no template estudados, com o uso do sistema como FERRAMENTA DE APOIO à autoria, com revisão humana, e não como substituto do especialista. O experimento completo, com corpus, dados brutos congelados, reanálise verificada, código e documentação, está publicado para reprodução e extensão independentes.</w:t>
-      </w:r>
-    </w:p>
-    <w:bookmarkEnd w:id="83"/>
-    <w:bookmarkStart w:id="85" w:name="disponibilidade-de-dados-e-código"/>
+        <w:t xml:space="preserve">O que este estudo NÃO estabelece, por desenho: a qualidade do grafo completo (dicas, remediações e múltiplos caminhos não são comparados), a equivalência funcional entre tutores, a não inferioridade em relação a especialistas (não estimável sem banda humano-humano), a validade pedagógica dos excedentes e qualquer efeito sobre aprendizagem. Esses níveis exigem, respectivamente, a comparação baseada em traços sobre o esquema ampliado, a bateria independente, a coleta com múltiplos especialistas, a anotação humana e o estudo com estudantes, todos especificados como fases futuras. Os resultados atuais são compatíveis, no domínio e no template estudados, com o uso do sistema como FERRAMENTA DE APOIO à autoria, com revisão humana, e não como substituto do especialista. A campanha 3, sob protocolo integralmente congelado antes da execução e entrada independente do grafo de referência, estabeleceu a estimativa limpa de cobertura (0,243), quantificou o vazamento da entrada anterior (~13 pontos), refutou a dependência de catálogo, identificou o alvo numérico do prompt como o freio dominante (+17,7 pontos ao relaxá-lo, único efeito que sobrevive à correção) e mediu concordância substancial entre três famílias de juízes. O experimento completo, com corpus, dados brutos congelados das três campanhas, manifestos de execução com custo por chamada, reanálises verificadas em sala limpa, código e documentação, está publicado para reprodução e extensão independentes.</w:t>
+      </w:r>
+    </w:p>
+    <w:bookmarkEnd w:id="85"/>
+    <w:bookmarkStart w:id="87" w:name="disponibilidade-de-dados-e-código"/>
     <w:p>
       <w:pPr>
         <w:pStyle w:val="Heading2"/>
@@ -6387,7 +7061,7 @@
       <w:r>
         <w:t xml:space="preserve"> </w:t>
       </w:r>
-      <w:hyperlink r:id="rId84">
+      <w:hyperlink r:id="rId86">
         <w:r>
           <w:rPr>
             <w:rStyle w:val="Hyperlink"/>
@@ -6438,8 +7112,8 @@
         <w:t xml:space="preserve">preserva, com manifesto SHA-256, o estado exato que produziu as versões anteriores deste relatório.</w:t>
       </w:r>
     </w:p>
-    <w:bookmarkEnd w:id="85"/>
-    <w:bookmarkStart w:id="86" w:name="declarações"/>
+    <w:bookmarkEnd w:id="87"/>
+    <w:bookmarkStart w:id="88" w:name="declarações"/>
     <w:p>
       <w:pPr>
         <w:pStyle w:val="Heading2"/>
@@ -6562,8 +7236,8 @@
         <w:t xml:space="preserve">; hashes SHA-256 de todos os artefatos estão versionados no repositório.</w:t>
       </w:r>
     </w:p>
-    <w:bookmarkEnd w:id="86"/>
-    <w:bookmarkStart w:id="87" w:name="referências"/>
+    <w:bookmarkEnd w:id="88"/>
+    <w:bookmarkStart w:id="89" w:name="referências"/>
     <w:p>
       <w:pPr>
         <w:pStyle w:val="Heading2"/>
@@ -7040,7 +7714,7 @@
         <w:pStyle w:val="FirstParagraph"/>
       </w:pPr>
       <w:r>
-        <w:t xml:space="preserve">Relatório técnico do Experimento OE-A · EducaOFF / STI Unplugged · versão 3.0 (estudo exploratório), 12 de julho de 2026.</w:t>
+        <w:t xml:space="preserve">Relatório técnico do Experimento OE-A · EducaOFF / STI Unplugged · versão 3.1 (estudo exploratório), 13 de julho de 2026.</w:t>
       </w:r>
       <w:r>
         <w:br/>
@@ -7064,8 +7738,8 @@
         <w:t xml:space="preserve">no repositório do experimento.</w:t>
       </w:r>
     </w:p>
-    <w:bookmarkEnd w:id="87"/>
-    <w:bookmarkEnd w:id="88"/>
+    <w:bookmarkEnd w:id="89"/>
+    <w:bookmarkEnd w:id="90"/>
     <w:sectPr/>
   </w:body>
 </w:document>

</xml_diff>

<commit_message>
docs: v3.2 do relatório + README com campanha 3
Resposta ao parecer da v3.1: coprimárias comportamentais (R_bug/R_ok) como
resultado central e em tabela própria (8a), ICs da Tabela 8b corrigidos pela
fonte única (a v3.1 tinha transcrição manual — exatamente o erro que a regra
G2 proíbe; verificação programática número a número adicionada), contraste de
13,3 pontos reformulado como diferença entre protocolos (não medida causal do
vazamento), nulos reescritos como 'não detectado', efeito comportamental do
screenshot reportado (+0,056, p-Holm 9,6e-4), mutation testing movido de
futuro para executado, todas as contradições campanha-3-como-futuro
resolvidas, CSS de impressão sem barras de rolagem, PDF com numeração de
páginas e metadados corretos. Tag legacy-campaigns-2026-07 agora NO REMOTO
(nunca havia sido criada: o comando original foi bloqueado; recriada no
commit exato do congelamento, 219/219 hashes conferem).
</commit_message>
<xml_diff>
--- a/docs/RELATORIO-CAMPANHA-1.docx
+++ b/docs/RELATORIO-CAMPANHA-1.docx
@@ -7,7 +7,7 @@
         <w:pStyle w:val="Title"/>
       </w:pPr>
       <w:r>
-        <w:t xml:space="preserve">Geração por LLM de catálogos candidatos de respostas erradas: estudo exploratório (v3.1)</w:t>
+        <w:t xml:space="preserve">Geração por LLM de catálogos candidatos de respostas erradas: estudo exploratório (v3.2)</w:t>
       </w:r>
     </w:p>
     <w:p>
@@ -15,15 +15,15 @@
         <w:pStyle w:val="FirstParagraph"/>
       </w:pPr>
       <w:r>
-        <w:t xml:space="preserve">Geração por LLM de catálogos de respostas erradas e montagem determinística de grafos: estudo exploratório (v3.0)</w:t>
-      </w:r>
-    </w:p>
-    <w:p>
-      <w:pPr>
-        <w:pStyle w:val="BodyText"/>
-      </w:pPr>
-      <w:r>
-        <w:t xml:space="preserve">Relatório técnico · Estudo exploratório · Experimento OE-A · Versão 3.1</w:t>
+        <w:t xml:space="preserve">Geração por LLM de catálogos de respostas erradas e montagem determinística de grafos: estudo exploratório (v3.2)</w:t>
+      </w:r>
+    </w:p>
+    <w:p>
+      <w:pPr>
+        <w:pStyle w:val="BodyText"/>
+      </w:pPr>
+      <w:r>
+        <w:t xml:space="preserve">Relatório técnico · Estudo exploratório · Experimento OE-A · Versão 3.2</w:t>
       </w:r>
     </w:p>
     <w:bookmarkStart w:id="90" w:name="Xc3776bef04cdc8c08ee8a87d1f4d7a25866b5aa"/>
@@ -56,7 +56,7 @@
         <w:pStyle w:val="BodyText"/>
       </w:pPr>
       <w:r>
-        <w:t xml:space="preserve">Versão 3.1, 13 de julho de 2026 (campanhas exploratórias: 2, 8 a 10 e 13 de julho; reanálise: 12 de julho) · Dados e código: github.com/Joaoqueiroz-silva/sti-graph-validation (tag</w:t>
+        <w:t xml:space="preserve">Versão 3.2, 14 de julho de 2026 (campanhas exploratórias: 2, 8 a 10 e 13 de julho; reanálise: 12 de julho) · Dados e código: github.com/Joaoqueiroz-silva/sti-graph-validation (tag</w:t>
       </w:r>
       <w:r>
         <w:t xml:space="preserve"> </w:t>
@@ -105,7 +105,7 @@
         <w:t xml:space="preserve"> </w:t>
       </w:r>
       <w:r>
-        <w:t xml:space="preserve">dependem de grafos de comportamento: estruturas que codificam, por exercício, o caminho de resolução correto, os erros previstos e as remediações. A autoria manual desses grafos é o principal gargalo de escala do paradigma. Este estudo exploratório caracteriza três propriedades dos grafos produzidos por um pipeline que separa geração probabilística (agentes de LLM) de montagem determinística: a integridade estrutural, a cobertura dos valores de respostas erradas registrados no grafo CTAT de referência de um especialista e a plausibilidade, segundo um modelo-juiz, dos erros previstos além desse catálogo. O corpus reúne 24 exercícios de frações na reta numérica derivados de um único template, com um especialista de referência; o sistema autora a partir da interface, sem acesso ao grafo de referência (blindagem parcial, verificada por testes de vazamento). Nenhum dos grafos gerados violou as invariantes estruturais implementadas (72 grafos da campanha e 10.000 em testes de propriedades). A cobertura conceitual média foi de 0,376 (IC95% de 0,309 a 0,442), sem diferença detectável entre quatro famílias de modelos (p ajustado de 0,988 nas três comparações primárias) e crescente com a agregação de execuções (37% em execução única; 64% na união de três). O modelo-juiz classificou 83% dos excedentes como plausíveis, com taxas sensíveis à identidade do juiz. A concordância de classificação de respostas, corrigida pelo acaso, ficou próxima de zero (kappa médio de 0,007), resultado negativo atribuível à bateria autorreferente e que motiva uma bateria independente de traços. Uma terceira campanha, sob protocolo congelado antes da execução e entrada totalmente independente do grafo de referência, estabeleceu a estimativa limpa de cobertura (0,243, IC95% de 0,196 a 0,290), quantificou em cerca de 13 pontos percentuais o vazamento da entrada anterior e identificou o alvo numérico do prompt como o fator dominante do teto (+17,7 pontos ao relaxá-lo, único efeito entre seis ablações que sobrevive à correção de Holm). A não inferioridade em relação a especialistas não é estimável sem a banda humano-humano; a validade pedagógica dos excedentes e a eficácia educacional permanecem indeterminadas.</w:t>
+        <w:t xml:space="preserve">dependem de grafos de comportamento: estruturas que codificam, por exercício, o caminho de resolução correto, os erros previstos e as remediações. A autoria manual desses grafos é o principal gargalo de escala do paradigma. Este estudo exploratório caracteriza três propriedades dos grafos produzidos por um pipeline que separa geração probabilística (agentes de LLM) de montagem determinística: a integridade estrutural, a cobertura dos valores de respostas erradas registrados no grafo CTAT de referência de um especialista e a plausibilidade, segundo um modelo-juiz, dos erros previstos além desse catálogo. O corpus reúne 24 exercícios de frações na reta numérica derivados de um único template, com um especialista de referência; o sistema autora a partir da interface, sem acesso ao grafo de referência (blindagem parcial, verificada por testes de vazamento). Nenhum dos grafos gerados violou as invariantes estruturais implementadas (72 grafos da campanha e 10.000 em testes de propriedades). A cobertura conceitual média foi de 0,376 (IC95% de 0,309 a 0,442), sem diferença detectável entre quatro famílias de modelos (p ajustado de 0,988 nas três comparações primárias) e crescente com a agregação de execuções (37% em execução única; 64% na união de três). O modelo-juiz classificou 83% dos excedentes como plausíveis, com taxas sensíveis à identidade do juiz. A concordância de classificação de respostas, corrigida pelo acaso, ficou próxima de zero (kappa médio de 0,007), resultado negativo atribuível à bateria autorreferente e que motiva uma bateria independente de traços. Uma terceira campanha, sob protocolo congelado antes da execução e entrada independente do grafo de referência, mediu os desfechos coprimários comportamentais e obteve o resultado central do estudo: a conformidade comportamental com a referência é BAIXA (reconhecimento de erros no estado correspondente de 0,065, IC95% de 0,020 a 0,113; nenhum traço correto completo da referência aceito passo a passo em nenhum braço). A cobertura por valor, métrica secundária de comparabilidade histórica, foi de 0,243 (IC95% de 0,163 a 0,324), 13,3 pontos abaixo do protocolo anterior; como fonte, KCs e idioma da entrada mudaram simultaneamente, o contraste não isola a contribuição de cada fator. Entre seis ablações, o alvo numérico do prompt foi o único efeito de cobertura que sobreviveu à correção de Holm (+17,7 pontos ao pedir seis candidatos, sob maior orçamento de saída); a representação com screenshot aumentou a concordância comportamental (+0,056, família exploratória). A não inferioridade em relação a especialistas não é estimável sem a banda humano-humano; a validade pedagógica dos excedentes e a eficácia educacional permanecem indeterminadas.</w:t>
       </w:r>
     </w:p>
     <w:p>
@@ -141,7 +141,7 @@
         <w:t xml:space="preserve"> </w:t>
       </w:r>
       <w:r>
-        <w:t xml:space="preserve">Example-tracing intelligent tutoring systems rely on behavior graphs: per-exercise structures encoding the correct solution path, anticipated errors, and their remediations. Manual authoring of such graphs is the paradigm's main scalability bottleneck. This exploratory study characterizes three properties of graphs produced by a pipeline that separates probabilistic generation (LLM agents) from deterministic assembly: structural integrity, coverage of the wrong-answer values recorded in an expert's reference CTAT graph, and the plausibility, according to a judge model, of errors predicted beyond that catalog. The corpus comprises 24 fraction number-line exercises derived from a single template, with one reference expert; the system authors from the interface without access to the reference graph (partial shielding, verified by leakage tests). No generated graph violated the implemented structural invariants (72 campaign graphs and 10,000 property-tested graphs). Mean conceptual coverage was 0.376 (95% CI 0.309 to 0.442), with no detectable difference across four model families (adjusted p of 0.988 in all three primary comparisons), and increased with run aggregation (37% single run; 64% for the union of three). The judge model classified 83% of the surplus errors as plausible, with rates sensitive to judge identity. Chance-corrected response-classification agreement was near zero (mean kappa 0.007), a negative result attributable to the self-referential battery and motivating an independent trace battery. A third campaign, under a protocol frozen before execution and with input fully independent of the reference graph, established the clean coverage estimate (0.243, 95% CI 0.196 to 0.290), quantified the previous input leakage at about 13 percentage points, and identified the prompt\u2019s numeric target as the dominant ceiling factor (+17.7 points when relaxed, the only effect among six ablations surviving Holm correction). Non-inferiority to experts is not estimable without a human-to-human band; pedagogical validity of surpluses and educational effectiveness remain undetermined.</w:t>
+        <w:t xml:space="preserve">Example-tracing intelligent tutoring systems rely on behavior graphs: per-exercise structures encoding the correct solution path, anticipated errors, and their remediations. Manual authoring of such graphs is the paradigm's main scalability bottleneck. This exploratory study characterizes three properties of graphs produced by a pipeline that separates probabilistic generation (LLM agents) from deterministic assembly: structural integrity, coverage of the wrong-answer values recorded in an expert's reference CTAT graph, and the plausibility, according to a judge model, of errors predicted beyond that catalog. The corpus comprises 24 fraction number-line exercises derived from a single template, with one reference expert; the system authors from the interface without access to the reference graph (partial shielding, verified by leakage tests). No generated graph violated the implemented structural invariants (72 campaign graphs and 10,000 property-tested graphs). Mean conceptual coverage was 0.376 (95% CI 0.309 to 0.442), with no detectable difference across four model families (adjusted p of 0.988 in all three primary comparisons), and increased with run aggregation (37% single run; 64% for the union of three). The judge model classified 83% of the surplus errors as plausible, with rates sensitive to judge identity. Chance-corrected response-classification agreement was near zero (mean kappa 0.007), a negative result attributable to the self-referential battery and motivating an independent trace battery. A third campaign, under a protocol frozen before execution and with input independent of the reference graph, measured the behavioral coprimary outcomes and yielded the study's central result: behavioral conformity with the reference is LOW (in-context error recognition of 0.065, 95% CI 0.020 to 0.113; no complete correct reference trace accepted step by step in any arm). Value coverage, a secondary metric kept for historical comparability, was 0.243 (95% CI 0.163 to 0.324), 13.3 points below the previous protocol; since input source, KCs, and language changed simultaneously, the contrast does not isolate each factor. Among six ablations, the prompt's numeric target was the only coverage effect surviving Holm correction (+17.7 points when requesting six candidates, under a larger output budget); the screenshot representation increased behavioral agreement (+0.056, exploratory family). Non-inferiority to experts is not estimable without a human-to-human band; pedagogical validity of surpluses and educational effectiveness remain undetermined.</w:t>
       </w:r>
     </w:p>
     <w:p>
@@ -442,7 +442,7 @@
         <w:pStyle w:val="Compact"/>
       </w:pPr>
       <w:r>
-        <w:t xml:space="preserve">duas</w:t>
+        <w:t xml:space="preserve">três</w:t>
       </w:r>
       <w:r>
         <w:t xml:space="preserve"> </w:t>
@@ -458,7 +458,7 @@
         <w:t xml:space="preserve"> </w:t>
       </w:r>
       <w:r>
-        <w:t xml:space="preserve">(24 exercícios, três réplicas cada, quatro famílias de modelos, intervalos de confiança), com dados brutos, código e corpus publicados para reprodução independente.</w:t>
+        <w:t xml:space="preserve">(24 exercícios, três réplicas por condição, quatro famílias de modelos, a terceira sob protocolo integralmente congelado antes da execução), com dados brutos, manifestos de execução, código e corpus publicados para reprodução independente.</w:t>
       </w:r>
     </w:p>
     <w:p>
@@ -1054,7 +1054,7 @@
         <w:t xml:space="preserve">blindagem parcial</w:t>
       </w:r>
       <w:r>
-        <w:t xml:space="preserve">, não independência total de fonte. A reconstrução do Envelope A a partir de fonte independente do grafo (o HTML e o DOM da interface, o screenshot e o gabarito do arquivo de produção em massa, todos disponíveis no corpus), acompanhada de teste metamórfico (mutações no grafo de referência não podem alterar um byte do envelope), está especificada como próxima etapa do programa experimental e exigirá nova campanha.</w:t>
+        <w:t xml:space="preserve">, não independência total de fonte. A reconstrução do Envelope A a partir de fonte independente do grafo (o HTML e o DOM da interface, o screenshot e o gabarito do arquivo de produção em massa, todos disponíveis no corpus), acompanhada de teste metamórfico (mutações no grafo de referência não alteram um byte do envelope), FOI EXECUTADA: é o protocolo v2 da campanha 3 (Seções 3.11 e 4.11). A descrição acima documenta o protocolo v1, usado nas campanhas 1 e 2.</w:t>
       </w:r>
     </w:p>
     <w:p>
@@ -1345,7 +1345,7 @@
         <w:t xml:space="preserve"> </w:t>
       </w:r>
       <w:r>
-        <w:t xml:space="preserve">(denominada "equivalência funcional" nas versões 1.0 a 2.1; renomeada porque o instrumento não executa o tutor): concordância de veredito entre os dois grafos ante uma mesma bateria de respostas (acerto, erro previsto, surpresa), com concordância bruta, kappa de Cohen e matriz de confusão. A bateria atual é a união das respostas dos dois grafos, o que a torna autorreferente: um item classificado como surpresa pelos dois lados é impossível por construção, a concordância esperada por acaso é alta e o kappa é estruturalmente deprimido (resultado negativo reportado na Seção 4.2);</w:t>
+        <w:t xml:space="preserve">(denominada "equivalência funcional" nas versões 1.0 a 2.1; renomeada porque o instrumento não executa o tutor): concordância de veredito entre os dois grafos ante uma mesma bateria de respostas (acerto, erro previsto, surpresa), com concordância bruta, kappa de Cohen e matriz de confusão. A bateria atual é a união das respostas dos dois grafos, o que a torna autorreferente: um item classificado como surpresa pelos dois lados é impossível por construção, a concordância esperada por acaso é alta e o kappa é estruturalmente deprimido (resultado negativo reportado na Seção 4.2). A bateria independente que corrige isso foi construída e usada na campanha 3;</w:t>
       </w:r>
     </w:p>
     <w:p>
@@ -1731,7 +1731,7 @@
         <w:t xml:space="preserve">nenhuma violação das invariantes implementadas foi observada</w:t>
       </w:r>
       <w:r>
-        <w:t xml:space="preserve">. Como verificador e montador implementam o mesmo conjunto de regras, o resultado não constitui prova de ausência de defeito em geral; a sensibilidade do verificador a defeitos deliberadamente injetados (mutation testing, com reporte de sensibilidade e especificidade por classe de defeito) integra a próxima etapa do programa experimental. O verificador foi ainda incorporado à plataforma como barreira de produção, de modo que um grafo que viole as invariantes não alcança alunos.</w:t>
+        <w:t xml:space="preserve">. Como verificador e montador implementam o mesmo conjunto de regras, o resultado não constitui prova de ausência de defeito em geral; a sensibilidade do verificador foi medida por mutation testing: dez classes de defeito deliberadamente injetadas em 26 grafos-base produziram 260 mutantes, todos detectados (sensibilidade 100%), com zero sinal espúrio nas bases intactas (especificidade 100%); a conclusão vale para as classes cobertas pela suíte, e o relatório integra o repositório. O verificador foi ainda incorporado à plataforma como barreira de produção, de modo que um grafo que viole as invariantes não alcança alunos.</w:t>
       </w:r>
     </w:p>
     <w:bookmarkEnd w:id="58"/>
@@ -2593,7 +2593,7 @@
         <w:pStyle w:val="FirstParagraph"/>
       </w:pPr>
       <w:r>
-        <w:t xml:space="preserve">Nenhum dos 72 grafos autorados na avaliação apresentou violação dura ou sinal mole, e o mesmo vale para os 10.000 grafos dos testes de propriedades. A banda histórica do escore de sinais moles resultou degenerada em zero (µ=0, σ=0, n=144), o que estabelece um regime de vigilância estrito: qualquer sinal mole em geração subsequente constitui anomalia. Conclui-se que nenhuma violação das invariantes implementadas foi observada, e a QP1 é respondida afirmativamente PARA as invariantes cobertas; a demonstração de sensibilidade do verificador a defeitos injetados fica para o mutation testing programado (Seção 3.7).</w:t>
+        <w:t xml:space="preserve">Nenhum dos 72 grafos autorados na avaliação apresentou violação dura ou sinal mole, e o mesmo vale para os 10.000 grafos dos testes de propriedades. A banda histórica do escore de sinais moles resultou degenerada em zero (µ=0, σ=0, n=144), o que estabelece um regime de vigilância estrito: qualquer sinal mole em geração subsequente constitui anomalia. Conclui-se que nenhuma violação das invariantes implementadas foi observada, e a QP1 é respondida afirmativamente PARA as invariantes cobertas; a sensibilidade do verificador a defeitos injetados foi demonstrada pelo mutation testing (260/260 nas dez classes cobertas; Seção 3.7).</w:t>
       </w:r>
     </w:p>
     <w:bookmarkEnd w:id="67"/>
@@ -2916,7 +2916,7 @@
         <w:t xml:space="preserve"> </w:t>
       </w:r>
       <w:r>
-        <w:t xml:space="preserve">pela própria correção de acaso que o método promete, a concordância de classificação entre os dois grafos não excede o acaso. A matriz de confusão agregada (abaixo) explica o mecanismo: os dois lados concordam integralmente na resposta correta (72 de 72), o sistema cobre 91 dos 249 itens de erro da referência e adiciona 116 itens que a referência não registra; como a bateria é a união dos dois catálogos, a célula surpresa×surpresa é impossível por construção, não há verdadeiros negativos e o κ é estruturalmente deprimido. O achado desautoriza o uso do termo "equivalência funcional" para o instrumento atual e motiva a bateria independente de traços, congelada antes da geração, especificada como próxima etapa.</w:t>
+        <w:t xml:space="preserve">pela própria correção de acaso que o método promete, a concordância de classificação entre os dois grafos não excede o acaso. A matriz de confusão agregada (abaixo) explica o mecanismo: os dois lados concordam integralmente na resposta correta (72 de 72), o sistema cobre 91 dos 249 itens de erro da referência e adiciona 116 itens que a referência não registra; como a bateria é a união dos dois catálogos, a célula surpresa×surpresa é impossível por construção, não há verdadeiros negativos e o κ é estruturalmente deprimido. O achado desautoriza o uso do termo "equivalência funcional" para o instrumento atual e motivou a bateria independente de traços da campanha 3 (com verdadeiros negativos por construção; o κ comportamental medido sob o instrumento corrigido, 0,037, confirma o diagnóstico).</w:t>
       </w:r>
     </w:p>
     <w:p>
@@ -5984,7 +5984,7 @@
         <w:t xml:space="preserve">ponto cego qualitativo</w:t>
       </w:r>
       <w:r>
-        <w:t xml:space="preserve">: a resposta composta apenas pelo denominador, presente no catálogo da referência em praticamente todos os exercícios, é raramente prevista (14% em execução única; 33% mesmo na união) por qualquer um dos quatro modelos. Trata-se de um erro de natureza pragmática (interpretação do campo de resposta pela criança), e não matemática; uma hipótese alternativa, não descartável com os dados atuais, é a assimetria informacional do protocolo: o autor da referência via a interface real do CTAT, enquanto os agentes recebem uma serialização textual dela. A ablação com representação visual da interface (o screenshot integra o corpus) está entre as prioridades da próxima campanha.</w:t>
+        <w:t xml:space="preserve">: a resposta composta apenas pelo denominador, presente no catálogo da referência em praticamente todos os exercícios, é raramente prevista (14% em execução única; 33% mesmo na união) por qualquer um dos quatro modelos. Trata-se de um erro de natureza pragmática (interpretação do campo de resposta pela criança), e não matemática; uma hipótese alternativa, não descartável com os dados atuais, é a assimetria informacional do protocolo: o autor da referência via a interface real do CTAT, enquanto os agentes recebem uma serialização textual dela. A ablação com representação visual foi executada na campanha 3 (Seção 4.11), com resultado misto: cobertura por valor inalterada, mas concordância comportamental maior (+0,056, p-Holm=9,6×10⁻⁴ na família exploratória).</w:t>
       </w:r>
     </w:p>
     <w:p>
@@ -6042,10 +6042,10 @@
           <w:bCs/>
           <w:b/>
         </w:rPr>
-        <w:t xml:space="preserve">0,243 [0,196; 0,290]</w:t>
-      </w:r>
-      <w:r>
-        <w:t xml:space="preserve">. A anatomia por tipo de erro localiza a diferença: a previsão de frações incorretas não mudou (39% nas duas condições de entrada), enquanto a de valores isolados desabou (numerador de 50% para 24%; outros inteiros de 73% para 0%). A causa é identificável: os KCs da entrada antiga, extraídos das regras de produção do grafo (nomes como</w:t>
+        <w:t xml:space="preserve">0,243 [0,163; 0,324]</w:t>
+      </w:r>
+      <w:r>
+        <w:t xml:space="preserve">. A anatomia por tipo de erro localiza a diferença: a previsão de frações incorretas não mudou (39% nas duas condições de entrada), enquanto a de valores isolados desabou (numerador de 50% para 24%; outros inteiros de 73% para 0%). Uma causa plausível e localizada é a remoção dos KCs da entrada, que eram extraídos das regras de produção do grafo (nomes como</w:t>
       </w:r>
       <w:r>
         <w:t xml:space="preserve"> </w:t>
@@ -6072,7 +6072,7 @@
         <w:t xml:space="preserve">IdenDenominator</w:t>
       </w:r>
       <w:r>
-        <w:t xml:space="preserve">), sinalizavam a existência de passos de identificação isolada. A diferença de cerca de 13 pontos percentuais é, portanto, a MEDIDA do vazamento de informação que a revisão externa suspeitou: o número antigo estava inflado por pistas derivadas do próprio material de referência, e o novo é a estimativa limpa. A troca do idioma do enunciado (inglês na fonte independente) é um fator concorrente declarado, separável em campanha futura.</w:t>
+        <w:t xml:space="preserve">) e sinalizavam a existência de passos de identificação isolada. A leitura correta do contraste, porém, é a modesta: sob o protocolo v2, que removeu os KCs derivados do grafo E mudou simultaneamente a fonte e o idioma da entrada, a cobertura foi 13,3 pontos menor; a diferença é entre PROTOCOLOS, e não identifica isoladamente a contribuição de cada mudança. A anatomia por categoria torna a explicação dos KCs a mais plausível, e a ablação que isola cada fator está declarada como trabalho futuro.</w:t>
       </w:r>
     </w:p>
     <w:p>
@@ -6084,13 +6084,44 @@
           <w:bCs/>
           <w:b/>
         </w:rPr>
-        <w:t xml:space="preserve">Tabela 8:</w:t>
-      </w:r>
-      <w:r>
-        <w:t xml:space="preserve"> </w:t>
-      </w:r>
-      <w:r>
-        <w:t xml:space="preserve">campanha 3 (protocolo v2), completude conceitual por condição (média por exercício, IC95%; 3 réplicas; zero falha de autoria). Testes pareados contra o baseline por permutação exata; Holm por família declarada (ablações: m=6).</w:t>
+        <w:t xml:space="preserve">Desfechos coprimários (o resultado central da campanha).</w:t>
+      </w:r>
+      <w:r>
+        <w:t xml:space="preserve"> </w:t>
+      </w:r>
+      <w:r>
+        <w:t xml:space="preserve">Pelo dicionário de métricas congelado antes da execução, os desfechos coprimários da campanha 3 são comportamentais: o reconhecimento das ações de erro da referência no estado correspondente (R_bug) e a conclusão dos traços corretos da referência (R_ok), ambos medidos pela bateria congelada sobre o executor de traços, com o nível de correspondência declarado por lado. O resultado é o achado mais importante do estudo e deve ser lido de frente:</w:t>
+      </w:r>
+      <w:r>
+        <w:t xml:space="preserve"> </w:t>
+      </w:r>
+      <w:r>
+        <w:rPr>
+          <w:bCs/>
+          <w:b/>
+        </w:rPr>
+        <w:t xml:space="preserve">a conformidade comportamental do grafo gerado com o grafo de referência é baixa</w:t>
+      </w:r>
+      <w:r>
+        <w:t xml:space="preserve">. No baseline, R_bug=0,065 [0,020; 0,113] e R_ok=0 (nenhum traço correto completo da referência é aceito passo a passo, em NENHUM dos nove braços); o κ da bateria independente, agora com verdadeiros negativos, fica em 0,037 [0,034; 0,039]. A anatomia item a item atribui o resultado à distância de granularidade e de ordem entre os ~4 passos conceituais do grafo gerado e os ~8 micropassos de interface da referência: mesmo cobrindo valores de erro, o grafo gerado não conduz um aluno que segue o caminho da referência até o fim, nem reconhece o erro NO passo em que a referência o espera. Cobertura de valores, o desfecho histórico, mede outra coisa e fica registrada como secundária.</w:t>
+      </w:r>
+    </w:p>
+    <w:p>
+      <w:pPr>
+        <w:pStyle w:val="BodyText"/>
+      </w:pPr>
+      <w:r>
+        <w:rPr>
+          <w:bCs/>
+          <w:b/>
+        </w:rPr>
+        <w:t xml:space="preserve">Tabela 8a:</w:t>
+      </w:r>
+      <w:r>
+        <w:t xml:space="preserve"> </w:t>
+      </w:r>
+      <w:r>
+        <w:t xml:space="preserve">desfechos coprimários comportamentais por condição (média por exercício, IC95%; bateria congelada; níveis de correspondência: referência exata, gerado por âncora de input).</w:t>
       </w:r>
     </w:p>
     <w:tbl>
@@ -6130,31 +6161,31 @@
               <w:jc w:val="left"/>
             </w:pPr>
             <w:r>
-              <w:t xml:space="preserve">Completude conceitual</w:t>
-            </w:r>
-          </w:p>
-        </w:tc>
-        <w:tc>
-          <w:tcPr/>
-          <w:p>
-            <w:pPr>
-              <w:pStyle w:val="Compact"/>
-              <w:jc w:val="left"/>
-            </w:pPr>
-            <w:r>
-              <w:t xml:space="preserve">Δ vs baseline [IC95%]</w:t>
-            </w:r>
-          </w:p>
-        </w:tc>
-        <w:tc>
-          <w:tcPr/>
-          <w:p>
-            <w:pPr>
-              <w:pStyle w:val="Compact"/>
-              <w:jc w:val="left"/>
-            </w:pPr>
-            <w:r>
-              <w:t xml:space="preserve">p-Holm</w:t>
+              <w:t xml:space="preserve">R_bug (erros em contexto)</w:t>
+            </w:r>
+          </w:p>
+        </w:tc>
+        <w:tc>
+          <w:tcPr/>
+          <w:p>
+            <w:pPr>
+              <w:pStyle w:val="Compact"/>
+              <w:jc w:val="left"/>
+            </w:pPr>
+            <w:r>
+              <w:t xml:space="preserve">R_ok (traços corretos)</w:t>
+            </w:r>
+          </w:p>
+        </w:tc>
+        <w:tc>
+          <w:tcPr/>
+          <w:p>
+            <w:pPr>
+              <w:pStyle w:val="Compact"/>
+              <w:jc w:val="left"/>
+            </w:pPr>
+            <w:r>
+              <w:t xml:space="preserve">Concordância</w:t>
             </w:r>
           </w:p>
         </w:tc>
@@ -6168,43 +6199,43 @@
               <w:jc w:val="left"/>
             </w:pPr>
             <w:r>
-              <w:t xml:space="preserve">Baseline (Gemini, envelope independente)</w:t>
-            </w:r>
-          </w:p>
-        </w:tc>
-        <w:tc>
-          <w:tcPr/>
-          <w:p>
-            <w:pPr>
-              <w:pStyle w:val="Compact"/>
-              <w:jc w:val="left"/>
-            </w:pPr>
-            <w:r>
-              <w:t xml:space="preserve">0,243 [0,196; 0,290]</w:t>
-            </w:r>
-          </w:p>
-        </w:tc>
-        <w:tc>
-          <w:tcPr/>
-          <w:p>
-            <w:pPr>
-              <w:pStyle w:val="Compact"/>
-              <w:jc w:val="left"/>
-            </w:pPr>
-            <w:r>
-              <w:t xml:space="preserve">—</w:t>
-            </w:r>
-          </w:p>
-        </w:tc>
-        <w:tc>
-          <w:tcPr/>
-          <w:p>
-            <w:pPr>
-              <w:pStyle w:val="Compact"/>
-              <w:jc w:val="left"/>
-            </w:pPr>
-            <w:r>
-              <w:t xml:space="preserve">—</w:t>
+              <w:t xml:space="preserve">Baseline (Gemini)</w:t>
+            </w:r>
+          </w:p>
+        </w:tc>
+        <w:tc>
+          <w:tcPr/>
+          <w:p>
+            <w:pPr>
+              <w:pStyle w:val="Compact"/>
+              <w:jc w:val="left"/>
+            </w:pPr>
+            <w:r>
+              <w:t xml:space="preserve">0,065 [0,020; 0,113]</w:t>
+            </w:r>
+          </w:p>
+        </w:tc>
+        <w:tc>
+          <w:tcPr/>
+          <w:p>
+            <w:pPr>
+              <w:pStyle w:val="Compact"/>
+              <w:jc w:val="left"/>
+            </w:pPr>
+            <w:r>
+              <w:t xml:space="preserve">0</w:t>
+            </w:r>
+          </w:p>
+        </w:tc>
+        <w:tc>
+          <w:tcPr/>
+          <w:p>
+            <w:pPr>
+              <w:pStyle w:val="Compact"/>
+              <w:jc w:val="left"/>
+            </w:pPr>
+            <w:r>
+              <w:t xml:space="preserve">0,275 [0,254; 0,296]</w:t>
             </w:r>
           </w:p>
         </w:tc>
@@ -6230,31 +6261,31 @@
               <w:jc w:val="left"/>
             </w:pPr>
             <w:r>
-              <w:t xml:space="preserve">0,178 [0,135; 0,224]</w:t>
-            </w:r>
-          </w:p>
-        </w:tc>
-        <w:tc>
-          <w:tcPr/>
-          <w:p>
-            <w:pPr>
-              <w:pStyle w:val="Compact"/>
-              <w:jc w:val="left"/>
-            </w:pPr>
-            <w:r>
-              <w:t xml:space="preserve">−0,065</w:t>
-            </w:r>
-          </w:p>
-        </w:tc>
-        <w:tc>
-          <w:tcPr/>
-          <w:p>
-            <w:pPr>
-              <w:pStyle w:val="Compact"/>
-              <w:jc w:val="left"/>
-            </w:pPr>
-            <w:r>
-              <w:t xml:space="preserve">n.s.</w:t>
+              <w:t xml:space="preserve">0,048 [0,019; 0,080]</w:t>
+            </w:r>
+          </w:p>
+        </w:tc>
+        <w:tc>
+          <w:tcPr/>
+          <w:p>
+            <w:pPr>
+              <w:pStyle w:val="Compact"/>
+              <w:jc w:val="left"/>
+            </w:pPr>
+            <w:r>
+              <w:t xml:space="preserve">0</w:t>
+            </w:r>
+          </w:p>
+        </w:tc>
+        <w:tc>
+          <w:tcPr/>
+          <w:p>
+            <w:pPr>
+              <w:pStyle w:val="Compact"/>
+              <w:jc w:val="left"/>
+            </w:pPr>
+            <w:r>
+              <w:t xml:space="preserve">0,299 [0,257; 0,343]</w:t>
             </w:r>
           </w:p>
         </w:tc>
@@ -6280,7 +6311,371 @@
               <w:jc w:val="left"/>
             </w:pPr>
             <w:r>
-              <w:t xml:space="preserve">0,199 [0,159; 0,240]</w:t>
+              <w:t xml:space="preserve">0,027 [0,013; 0,044]</w:t>
+            </w:r>
+          </w:p>
+        </w:tc>
+        <w:tc>
+          <w:tcPr/>
+          <w:p>
+            <w:pPr>
+              <w:pStyle w:val="Compact"/>
+              <w:jc w:val="left"/>
+            </w:pPr>
+            <w:r>
+              <w:t xml:space="preserve">0</w:t>
+            </w:r>
+          </w:p>
+        </w:tc>
+        <w:tc>
+          <w:tcPr/>
+          <w:p>
+            <w:pPr>
+              <w:pStyle w:val="Compact"/>
+              <w:jc w:val="left"/>
+            </w:pPr>
+            <w:r>
+              <w:t xml:space="preserve">0,284 [0,255; 0,311]</w:t>
+            </w:r>
+          </w:p>
+        </w:tc>
+      </w:tr>
+      <w:tr>
+        <w:tc>
+          <w:tcPr/>
+          <w:p>
+            <w:pPr>
+              <w:pStyle w:val="Compact"/>
+              <w:jc w:val="left"/>
+            </w:pPr>
+            <w:r>
+              <w:t xml:space="preserve">Limite de 6 candidatos</w:t>
+            </w:r>
+          </w:p>
+        </w:tc>
+        <w:tc>
+          <w:tcPr/>
+          <w:p>
+            <w:pPr>
+              <w:pStyle w:val="Compact"/>
+              <w:jc w:val="left"/>
+            </w:pPr>
+            <w:r>
+              <w:t xml:space="preserve">0,094 [0,037; 0,157]</w:t>
+            </w:r>
+          </w:p>
+        </w:tc>
+        <w:tc>
+          <w:tcPr/>
+          <w:p>
+            <w:pPr>
+              <w:pStyle w:val="Compact"/>
+              <w:jc w:val="left"/>
+            </w:pPr>
+            <w:r>
+              <w:t xml:space="preserve">0</w:t>
+            </w:r>
+          </w:p>
+        </w:tc>
+        <w:tc>
+          <w:tcPr/>
+          <w:p>
+            <w:pPr>
+              <w:pStyle w:val="Compact"/>
+              <w:jc w:val="left"/>
+            </w:pPr>
+            <w:r>
+              <w:t xml:space="preserve">0,276 [0,253; 0,297]</w:t>
+            </w:r>
+          </w:p>
+        </w:tc>
+      </w:tr>
+      <w:tr>
+        <w:tc>
+          <w:tcPr/>
+          <w:p>
+            <w:pPr>
+              <w:pStyle w:val="Compact"/>
+              <w:jc w:val="left"/>
+            </w:pPr>
+            <w:r>
+              <w:t xml:space="preserve">Screenshot</w:t>
+            </w:r>
+          </w:p>
+        </w:tc>
+        <w:tc>
+          <w:tcPr/>
+          <w:p>
+            <w:pPr>
+              <w:pStyle w:val="Compact"/>
+              <w:jc w:val="left"/>
+            </w:pPr>
+            <w:r>
+              <w:t xml:space="preserve">0,030 [0,012; 0,049]</w:t>
+            </w:r>
+          </w:p>
+        </w:tc>
+        <w:tc>
+          <w:tcPr/>
+          <w:p>
+            <w:pPr>
+              <w:pStyle w:val="Compact"/>
+              <w:jc w:val="left"/>
+            </w:pPr>
+            <w:r>
+              <w:t xml:space="preserve">0</w:t>
+            </w:r>
+          </w:p>
+        </w:tc>
+        <w:tc>
+          <w:tcPr/>
+          <w:p>
+            <w:pPr>
+              <w:pStyle w:val="Compact"/>
+              <w:jc w:val="left"/>
+            </w:pPr>
+            <w:r>
+              <w:rPr>
+                <w:bCs/>
+                <w:b/>
+              </w:rPr>
+              <w:t xml:space="preserve">0,331 [0,311; 0,353]</w:t>
+            </w:r>
+          </w:p>
+        </w:tc>
+      </w:tr>
+      <w:tr>
+        <w:tc>
+          <w:tcPr>
+            <w:gridSpan w:val="4"/>
+          </w:tcPr>
+          <w:p>
+            <w:pPr>
+              <w:pStyle w:val="Compact"/>
+              <w:jc w:val="left"/>
+            </w:pPr>
+            <w:r>
+              <w:t xml:space="preserve">Demais condições no repositório (</w:t>
+            </w:r>
+            <w:r>
+              <w:rPr>
+                <w:rStyle w:val="VerbatimChar"/>
+              </w:rPr>
+              <w:t xml:space="preserve">analysis/derived/TABELAS-C3.md</w:t>
+            </w:r>
+            <w:r>
+              <w:t xml:space="preserve">). Entre braços de modelo, nenhuma diferença coprimária detectada (p-Holm ≥ 0,44).</w:t>
+            </w:r>
+          </w:p>
+        </w:tc>
+      </w:tr>
+    </w:tbl>
+    <w:p>
+      <w:pPr>
+        <w:pStyle w:val="BodyText"/>
+      </w:pPr>
+      <w:r>
+        <w:rPr>
+          <w:bCs/>
+          <w:b/>
+        </w:rPr>
+        <w:t xml:space="preserve">Tabela 8b:</w:t>
+      </w:r>
+      <w:r>
+        <w:t xml:space="preserve"> </w:t>
+      </w:r>
+      <w:r>
+        <w:t xml:space="preserve">campanha 3 (protocolo v2), completude conceitual por condição (média por exercício, IC95%; 3 réplicas; zero falha de autoria). Testes pareados contra o baseline por permutação exata; Holm por família declarada (ablações: m=6).</w:t>
+      </w:r>
+    </w:p>
+    <w:tbl>
+      <w:tblPr>
+        <w:tblStyle w:val="Table"/>
+        <w:tblW w:type="auto" w:w="0"/>
+        <w:tblLook w:firstRow="1" w:lastRow="0" w:firstColumn="0" w:lastColumn="0" w:noHBand="0" w:noVBand="0" w:val="0020"/>
+        <w:jc w:val="start"/>
+      </w:tblPr>
+      <w:tblGrid>
+        <w:gridCol w:w="1980"/>
+        <w:gridCol w:w="1980"/>
+        <w:gridCol w:w="1980"/>
+        <w:gridCol w:w="1980"/>
+      </w:tblGrid>
+      <w:tr>
+        <w:trPr>
+          <w:tblHeader w:val="true"/>
+        </w:trPr>
+        <w:tc>
+          <w:tcPr/>
+          <w:p>
+            <w:pPr>
+              <w:pStyle w:val="Compact"/>
+              <w:jc w:val="left"/>
+            </w:pPr>
+            <w:r>
+              <w:t xml:space="preserve">Condição</w:t>
+            </w:r>
+          </w:p>
+        </w:tc>
+        <w:tc>
+          <w:tcPr/>
+          <w:p>
+            <w:pPr>
+              <w:pStyle w:val="Compact"/>
+              <w:jc w:val="left"/>
+            </w:pPr>
+            <w:r>
+              <w:t xml:space="preserve">Completude conceitual</w:t>
+            </w:r>
+          </w:p>
+        </w:tc>
+        <w:tc>
+          <w:tcPr/>
+          <w:p>
+            <w:pPr>
+              <w:pStyle w:val="Compact"/>
+              <w:jc w:val="left"/>
+            </w:pPr>
+            <w:r>
+              <w:t xml:space="preserve">Δ vs baseline [IC95%]</w:t>
+            </w:r>
+          </w:p>
+        </w:tc>
+        <w:tc>
+          <w:tcPr/>
+          <w:p>
+            <w:pPr>
+              <w:pStyle w:val="Compact"/>
+              <w:jc w:val="left"/>
+            </w:pPr>
+            <w:r>
+              <w:t xml:space="preserve">p-Holm</w:t>
+            </w:r>
+          </w:p>
+        </w:tc>
+      </w:tr>
+      <w:tr>
+        <w:tc>
+          <w:tcPr/>
+          <w:p>
+            <w:pPr>
+              <w:pStyle w:val="Compact"/>
+              <w:jc w:val="left"/>
+            </w:pPr>
+            <w:r>
+              <w:t xml:space="preserve">Baseline (Gemini, envelope independente)</w:t>
+            </w:r>
+          </w:p>
+        </w:tc>
+        <w:tc>
+          <w:tcPr/>
+          <w:p>
+            <w:pPr>
+              <w:pStyle w:val="Compact"/>
+              <w:jc w:val="left"/>
+            </w:pPr>
+            <w:r>
+              <w:t xml:space="preserve">0,243 [0,196; 0,290]</w:t>
+            </w:r>
+          </w:p>
+        </w:tc>
+        <w:tc>
+          <w:tcPr/>
+          <w:p>
+            <w:pPr>
+              <w:pStyle w:val="Compact"/>
+              <w:jc w:val="left"/>
+            </w:pPr>
+            <w:r>
+              <w:t xml:space="preserve">—</w:t>
+            </w:r>
+          </w:p>
+        </w:tc>
+        <w:tc>
+          <w:tcPr/>
+          <w:p>
+            <w:pPr>
+              <w:pStyle w:val="Compact"/>
+              <w:jc w:val="left"/>
+            </w:pPr>
+            <w:r>
+              <w:t xml:space="preserve">—</w:t>
+            </w:r>
+          </w:p>
+        </w:tc>
+      </w:tr>
+      <w:tr>
+        <w:tc>
+          <w:tcPr/>
+          <w:p>
+            <w:pPr>
+              <w:pStyle w:val="Compact"/>
+              <w:jc w:val="left"/>
+            </w:pPr>
+            <w:r>
+              <w:t xml:space="preserve">GLM-5.2</w:t>
+            </w:r>
+          </w:p>
+        </w:tc>
+        <w:tc>
+          <w:tcPr/>
+          <w:p>
+            <w:pPr>
+              <w:pStyle w:val="Compact"/>
+              <w:jc w:val="left"/>
+            </w:pPr>
+            <w:r>
+              <w:t xml:space="preserve">0,178 [0,122; 0,236]</w:t>
+            </w:r>
+          </w:p>
+        </w:tc>
+        <w:tc>
+          <w:tcPr/>
+          <w:p>
+            <w:pPr>
+              <w:pStyle w:val="Compact"/>
+              <w:jc w:val="left"/>
+            </w:pPr>
+            <w:r>
+              <w:t xml:space="preserve">−0,065</w:t>
+            </w:r>
+          </w:p>
+        </w:tc>
+        <w:tc>
+          <w:tcPr/>
+          <w:p>
+            <w:pPr>
+              <w:pStyle w:val="Compact"/>
+              <w:jc w:val="left"/>
+            </w:pPr>
+            <w:r>
+              <w:t xml:space="preserve">n.s.</w:t>
+            </w:r>
+          </w:p>
+        </w:tc>
+      </w:tr>
+      <w:tr>
+        <w:tc>
+          <w:tcPr/>
+          <w:p>
+            <w:pPr>
+              <w:pStyle w:val="Compact"/>
+              <w:jc w:val="left"/>
+            </w:pPr>
+            <w:r>
+              <w:t xml:space="preserve">DeepSeek V4 Pro</w:t>
+            </w:r>
+          </w:p>
+        </w:tc>
+        <w:tc>
+          <w:tcPr/>
+          <w:p>
+            <w:pPr>
+              <w:pStyle w:val="Compact"/>
+              <w:jc w:val="left"/>
+            </w:pPr>
+            <w:r>
+              <w:t xml:space="preserve">0,199 [0,143; 0,260]</w:t>
             </w:r>
           </w:p>
         </w:tc>
@@ -6338,7 +6733,7 @@
                 <w:bCs/>
                 <w:b/>
               </w:rPr>
-              <w:t xml:space="preserve">0,419 [0,376; 0,462]</w:t>
+              <w:t xml:space="preserve">0,419 [0,342; 0,495]</w:t>
             </w:r>
           </w:p>
         </w:tc>
@@ -6396,7 +6791,7 @@
               <w:jc w:val="left"/>
             </w:pPr>
             <w:r>
-              <w:t xml:space="preserve">0,238 [0,193; 0,283]</w:t>
+              <w:t xml:space="preserve">0,238 [0,171; 0,307]</w:t>
             </w:r>
           </w:p>
         </w:tc>
@@ -6446,7 +6841,7 @@
               <w:jc w:val="left"/>
             </w:pPr>
             <w:r>
-              <w:t xml:space="preserve">0,215 [0,171; 0,259]</w:t>
+              <w:t xml:space="preserve">0,215 [0,152; 0,282]</w:t>
             </w:r>
           </w:p>
         </w:tc>
@@ -6496,7 +6891,7 @@
               <w:jc w:val="left"/>
             </w:pPr>
             <w:r>
-              <w:t xml:space="preserve">0,207 [0,166; 0,249]</w:t>
+              <w:t xml:space="preserve">0,207 [0,134; 0,279]</w:t>
             </w:r>
           </w:p>
         </w:tc>
@@ -6546,7 +6941,7 @@
               <w:jc w:val="left"/>
             </w:pPr>
             <w:r>
-              <w:t xml:space="preserve">0,251 [0,204; 0,299]</w:t>
+              <w:t xml:space="preserve">0,251 [0,180; 0,324]</w:t>
             </w:r>
           </w:p>
         </w:tc>
@@ -6596,7 +6991,7 @@
               <w:jc w:val="left"/>
             </w:pPr>
             <w:r>
-              <w:t xml:space="preserve">0,203 [0,163; 0,244]</w:t>
+              <w:t xml:space="preserve">0,203 [0,147; 0,264]</w:t>
             </w:r>
           </w:p>
         </w:tc>
@@ -6631,7 +7026,7 @@
         <w:pStyle w:val="BodyText"/>
       </w:pPr>
       <w:r>
-        <w:t xml:space="preserve">Da família de seis ablações, exatamente UMA sobrevive à correção: elevar o alvo numérico do prompt de 2 a 3 para 6 candidatos quase dobra a cobertura (+17,7 pontos, p-Holm=2,4×10⁻⁵). Três resultados nulos são igualmente informativos. Primeiro, o catálogo interno de misconceptions não contribui nada (e a auditoria da campanha revelou que ele estava efetivamente INERTE nas campanhas anteriores, por um defeito de normalização de acento na chave de disciplina, o que desmonta por evidência a hipótese de que a cobertura viria do catálogo). Segundo, a instrução aberta de saturação ("liste todas") não altera o comportamento: o agente continua produzindo cerca de dois candidatos, enquanto o alvo numérico concreto produz 4,1; para este gerador, instrução quantitativa explícita funciona e instrução aberta não. Terceiro, nem o DOM nem o screenshot da interface moveram a cobertura, o que enfraquece a hipótese de assimetria informacional como explicação do ponto cego pragmático e mantém em aberto a origem do déficit de "denominador isolado".</w:t>
+        <w:t xml:space="preserve">Da família de seis ablações, exatamente UMA sobrevive à correção: elevar o alvo numérico do prompt de 2 a 3 para 6 candidatos quase dobra a cobertura (+17,7 pontos, p-Holm=2,4×10⁻⁵). O efeito do limite pede duas qualificações: a condição também recebeu maior orçamento de saída (4,1 candidatos por exercício contra ~2 do baseline), e o ganho NÃO se transfere ao desfecho coprimário (R_bug de 0,094 contra 0,065; diferença não detectada), então o achado demonstra alavanca de cobertura por valor, não melhoria comportamental global. Nos demais contrastes de cobertura, nenhuma diferença foi detectada com a amostra disponível: catálogo interno (que a auditoria da campanha revelou estar efetivamente INERTE nas campanhas anteriores, por defeito de normalização de acento na chave de disciplina, de modo que a cobertura histórica não pode ser atribuída a ele), instrução aberta de saturação (o agente segue produzindo ~2 candidatos; para este gerador, alvo quantitativo explícito funciona e instrução aberta não), DOM, screenshot e chamada única. Na família exploratória comportamental, porém, o screenshot AUMENTOU a concordância de vereditos (+0,056, p-Holm=9,6×10⁻⁴): ver a interface não muda quais valores o agente prevê, mas muda como o grafo responde à bateria; o efeito merece investigação própria.</w:t>
       </w:r>
     </w:p>
     <w:p>
@@ -6750,7 +7145,7 @@
         <w:pStyle w:val="BodyText"/>
       </w:pPr>
       <w:r>
-        <w:t xml:space="preserve">A campanha 3 fecha o ciclo aberto pela revisão externa com três respostas empíricas. A suspeita de vazamento era procedente e agora está QUANTIFICADA (cerca de 13 pontos percentuais de cobertura vinham de pistas derivadas do grafo, sobretudo os nomes de KCs); a suspeita de dependência do catálogo interno está refutada por ablação (efeito nulo, além da descoberta de que o catálogo estava inerte); e o teto de cobertura tem agora um mecanismo dominante identificado e acionável, o alvo numérico do prompt, cujo relaxamento para seis candidatos quase dobra a cobertura com uma única execução. A hipótese visual (o modelo não vê a interface) NÃO se sustentou nesta interface: screenshot e DOM não moveram a métrica. O caminho de engenharia que emerge é barato e mensurável: alvo numérico maior, agregação de poucas execuções e julgamento automatizado com painel, tudo sob revisão humana.</w:t>
+        <w:t xml:space="preserve">A campanha 3 reordena a leitura do estudo. O resultado central é comportamental e é baixo: o grafo gerado cobre parte dos VALORES de erro da referência, mas não reproduz o COMPORTAMENTO dela (R_ok=0; R_bug=0,065), sobretudo por granularidade e ordem dos passos. Sobre as suspeitas da revisão externa: o contraste entre protocolos (13,3 pontos de cobertura) é compatível com vazamento pela entrada antiga, com os KCs como explicação mais plausível pela anatomia por categoria, mas fonte, KCs e idioma mudaram juntos e a atribuição causal exata fica para a ablação futura; a dependência do catálogo interno não foi detectada (e ele estava inerte nas campanhas anteriores); o alvo numérico do prompt é a única alavanca de cobertura confirmada (+17,7 pontos, sob maior orçamento de saída e sem ganho coprimário detectável); e a representação visual não moveu cobertura, mas aumentou a concordância comportamental, resultado misto que mantém a hipótese de affordance viva no plano do comportamento. O caminho de engenharia continua barato e mensurável, agora com a régua certa: qualquer melhoria futura deve ser cobrada nos desfechos coprimários, não apenas na cobertura por valor.</w:t>
       </w:r>
     </w:p>
     <w:p>
@@ -6816,7 +7211,7 @@
         <w:t xml:space="preserve"> </w:t>
       </w:r>
       <w:r>
-        <w:t xml:space="preserve">O protocolo de envelopes é verificado mecanicamente e o teste de vazamento inclui controle negativo, mas a blindagem é PARCIAL: o Envelope A deriva do mesmo arquivo que contém o grafo de referência e o teste é lexical (Seção 3.3). Há ainda assimetria informacional entre as condições: o autor da referência via a interface real, enquanto os agentes recebem uma serialização textual dela, o que pode explicar parte do ponto cego pragmático (Seção 4.10). A resposta correta no Envelope A é decisão declarada de desenho. As réplicas e os intervalos reportados absorvem a estocasticidade dos agentes; falhas de chamada e acionamentos de contingência não foram registrados por corrida nas campanhas atuais, lacuna de manifesto que a próxima campanha corrige.</w:t>
+        <w:t xml:space="preserve">O protocolo de envelopes é verificado mecanicamente e o teste de vazamento inclui controle negativo, mas a blindagem é PARCIAL: o Envelope A deriva do mesmo arquivo que contém o grafo de referência e o teste é lexical (Seção 3.3). Há ainda assimetria informacional entre as condições: o autor da referência via a interface real, enquanto os agentes recebem uma serialização textual dela, o que pode explicar parte do ponto cego pragmático (Seção 4.10). A resposta correta no Envelope A é decisão declarada de desenho. As réplicas e os intervalos reportados absorvem a estocasticidade dos agentes; falhas de chamada e acionamentos de contingência não foram registrados nas campanhas 1 e 2; a campanha 3 corrigiu a lacuna com manifesto por chamada (zero falha de autoria em 648 execuções).</w:t>
       </w:r>
     </w:p>
     <w:p>
@@ -6962,13 +7357,13 @@
           <w:bCs/>
           <w:b/>
         </w:rPr>
-        <w:t xml:space="preserve">Independência total do Envelope A e comparação do grafo completo:</w:t>
-      </w:r>
-      <w:r>
-        <w:t xml:space="preserve"> </w:t>
-      </w:r>
-      <w:r>
-        <w:t xml:space="preserve">reconstruir a entrada dos agentes a partir do HTML/DOM da interface e do gabarito de produção em massa (fontes independentes do grafo, já presentes no corpus), com teste metamórfico de independência; ampliar o esquema neutro para estados, tripla seleção-ação-input, múltiplos caminhos, dicas e remediações, com round-trip verificado; substituir a bateria autorreferente por bateria independente de traços congelada antes da geração; validar o verificador de invariantes por mutation testing. Após essas mudanças, repetir as campanhas (somente custo de API).</w:t>
+        <w:t xml:space="preserve">EXECUTADO (campanha 3):</w:t>
+      </w:r>
+      <w:r>
+        <w:t xml:space="preserve"> </w:t>
+      </w:r>
+      <w:r>
+        <w:t xml:space="preserve">Envelope A independente com teste metamórfico, esquema v2 com executor de traços, bateria independente congelada e mutation testing do verificador. Permanecem futuras: a execução dos grafos no runtime real do CTAT e a ablação que isole os fatores confundidos do contraste entre protocolos (KCs, idioma e fonte da entrada).</w:t>
       </w:r>
     </w:p>
     <w:p>
@@ -6984,13 +7379,13 @@
           <w:bCs/>
           <w:b/>
         </w:rPr>
-        <w:t xml:space="preserve">Ablações declaradas:</w:t>
-      </w:r>
-      <w:r>
-        <w:t xml:space="preserve"> </w:t>
-      </w:r>
-      <w:r>
-        <w:t xml:space="preserve">catálogo interno ligado contra desligado; limite de 2 a 3 candidatos contra geração até saturação; representação textual contra DOM e contra DOM com screenshot; KCs presentes contra ausentes; chamada única contra arquitetura multiagente; baselines sem LLM (amostragem do catálogo com o mesmo orçamento); painel de três famílias de juízes com concordância entre eles.</w:t>
+        <w:t xml:space="preserve">EXECUTADAS (campanha 3):</w:t>
+      </w:r>
+      <w:r>
+        <w:t xml:space="preserve"> </w:t>
+      </w:r>
+      <w:r>
+        <w:t xml:space="preserve">as ablações de catálogo, limite, saturação, DOM, screenshot e chamada única, e o painel de três famílias de juízes. Permanecem futuras: KCs presentes contra ausentes (isolamento do confundidor) e baselines sem LLM com o mesmo orçamento de candidatos.</w:t>
       </w:r>
     </w:p>
     <w:p>
@@ -7038,7 +7433,7 @@
         <w:pStyle w:val="BodyText"/>
       </w:pPr>
       <w:r>
-        <w:t xml:space="preserve">O que este estudo NÃO estabelece, por desenho: a qualidade do grafo completo (dicas, remediações e múltiplos caminhos não são comparados), a equivalência funcional entre tutores, a não inferioridade em relação a especialistas (não estimável sem banda humano-humano), a validade pedagógica dos excedentes e qualquer efeito sobre aprendizagem. Esses níveis exigem, respectivamente, a comparação baseada em traços sobre o esquema ampliado, a bateria independente, a coleta com múltiplos especialistas, a anotação humana e o estudo com estudantes, todos especificados como fases futuras. Os resultados atuais são compatíveis, no domínio e no template estudados, com o uso do sistema como FERRAMENTA DE APOIO à autoria, com revisão humana, e não como substituto do especialista. A campanha 3, sob protocolo integralmente congelado antes da execução e entrada independente do grafo de referência, estabeleceu a estimativa limpa de cobertura (0,243), quantificou o vazamento da entrada anterior (~13 pontos), refutou a dependência de catálogo, identificou o alvo numérico do prompt como o freio dominante (+17,7 pontos ao relaxá-lo, único efeito que sobrevive à correção) e mediu concordância substancial entre três famílias de juízes. O experimento completo, com corpus, dados brutos congelados das três campanhas, manifestos de execução com custo por chamada, reanálises verificadas em sala limpa, código e documentação, está publicado para reprodução e extensão independentes.</w:t>
+        <w:t xml:space="preserve">O que este estudo NÃO estabelece, por desenho: a qualidade do grafo completo (dicas, remediações e múltiplos caminhos não são comparados), a equivalência funcional entre tutores, a não inferioridade em relação a especialistas (não estimável sem banda humano-humano), a validade pedagógica dos excedentes e qualquer efeito sobre aprendizagem. Esses níveis exigem, respectivamente, a comparação baseada em traços sobre o esquema ampliado, a bateria independente, a coleta com múltiplos especialistas, a anotação humana e o estudo com estudantes, todos especificados como fases futuras. Os resultados atuais são compatíveis, no domínio e no template estudados, com o uso do sistema como FERRAMENTA DE APOIO à autoria, com revisão humana, e não como substituto do especialista. A campanha 3, sob protocolo integralmente congelado antes da execução e entrada independente do grafo de referência, mediu pela primeira vez os desfechos coprimários comportamentais e entregou o resultado central do estudo: a conformidade comportamental é baixa (R_bug=0,065; R_ok=0), com anatomia identificada na granularidade e na ordem dos passos. A cobertura por valor sob o protocolo v2 é 0,243 (13,3 pontos abaixo do protocolo anterior, contraste que não isola causa); o alvo numérico do prompt é a única alavanca de cobertura que sobrevive à correção (+17,7 pontos, sob maior orçamento de saída e sem ganho coprimário detectável); a representação com screenshot aumentou a concordância comportamental; e o painel de três famílias de juízes apresentou concordância de moderada a substancial. O experimento completo, com corpus, dados brutos congelados das três campanhas, manifestos de execução com custo por chamada, reanálises verificadas em sala limpa, código e documentação, está publicado para reprodução e extensão independentes.</w:t>
       </w:r>
     </w:p>
     <w:bookmarkEnd w:id="85"/>
@@ -7085,7 +7480,7 @@
         <w:t xml:space="preserve"> </w:t>
       </w:r>
       <w:r>
-        <w:t xml:space="preserve">e interface), a base de dados com os envelopes A e B por exercício, os relatórios brutos das duas campanhas (nove da campanha 1 e vinte e quatro da campanha 2 multimodelo) com os agregados estatísticos, a reanálise geradora de todos os números desta versão (</w:t>
+        <w:t xml:space="preserve">e interface), a base de dados com os envelopes A e B por exercício, os relatórios brutos das três campanhas (nove da campanha 1, vinte e quatro da campanha 2 multimodelo e vinte e sete da campanha 3, esta com manifestos de execução por chamada, curva de ensemble e painel de juízes) com os agregados estatísticos, as reanálises geradoras de todos os números desta versão (</w:t>
       </w:r>
       <w:r>
         <w:rPr>
@@ -7094,7 +7489,7 @@
         <w:t xml:space="preserve">analysis/</w:t>
       </w:r>
       <w:r>
-        <w:t xml:space="preserve">), a metodologia, o plano de análise com as Emendas 1 a 3 datadas e as instruções de reprodução (Node.js 18+ e uma credencial OpenRouter; aproximadamente US$ 1 por corrida completa). A análise estatística usa semente fixa e é exatamente reprodutível a partir dos dados publicados; a tag</w:t>
+        <w:t xml:space="preserve">), a metodologia, o dicionário formal de métricas, o plano de análise com as Emendas 1 a 4 datadas e as instruções de reprodução (Node.js 18+ e uma credencial OpenRouter; aproximadamente US$ 1 por corrida completa). A análise estatística usa semente fixa e é exatamente reprodutível a partir dos dados publicados; a tag</w:t>
       </w:r>
       <w:r>
         <w:t xml:space="preserve"> </w:t>
@@ -7714,7 +8109,7 @@
         <w:pStyle w:val="FirstParagraph"/>
       </w:pPr>
       <w:r>
-        <w:t xml:space="preserve">Relatório técnico do Experimento OE-A · EducaOFF / STI Unplugged · versão 3.1 (estudo exploratório), 13 de julho de 2026.</w:t>
+        <w:t xml:space="preserve">Relatório técnico do Experimento OE-A · EducaOFF / STI Unplugged · versão 3.2 (estudo exploratório), 14 de julho de 2026.</w:t>
       </w:r>
       <w:r>
         <w:br/>

</xml_diff>

<commit_message>
docs: v3.3 (rOkCompleted, F4 post-hoc na Tabela 8b, QP2 comportamental, v1/v2 rotulados, formulações do parecer)
</commit_message>
<xml_diff>
--- a/docs/RELATORIO-CAMPANHA-1.docx
+++ b/docs/RELATORIO-CAMPANHA-1.docx
@@ -7,7 +7,7 @@
         <w:pStyle w:val="Title"/>
       </w:pPr>
       <w:r>
-        <w:t xml:space="preserve">Geração por LLM de catálogos candidatos de respostas erradas: estudo exploratório (v3.2)</w:t>
+        <w:t xml:space="preserve">Geração por LLM de catálogos candidatos de respostas erradas: estudo exploratório (v3.3)</w:t>
       </w:r>
     </w:p>
     <w:p>
@@ -15,15 +15,15 @@
         <w:pStyle w:val="FirstParagraph"/>
       </w:pPr>
       <w:r>
-        <w:t xml:space="preserve">Geração por LLM de catálogos de respostas erradas e montagem determinística de grafos: estudo exploratório (v3.2)</w:t>
-      </w:r>
-    </w:p>
-    <w:p>
-      <w:pPr>
-        <w:pStyle w:val="BodyText"/>
-      </w:pPr>
-      <w:r>
-        <w:t xml:space="preserve">Relatório técnico · Estudo exploratório · Experimento OE-A · Versão 3.2</w:t>
+        <w:t xml:space="preserve">Geração por LLM de catálogos de respostas erradas e montagem determinística de grafos: estudo exploratório (v3.3)</w:t>
+      </w:r>
+    </w:p>
+    <w:p>
+      <w:pPr>
+        <w:pStyle w:val="BodyText"/>
+      </w:pPr>
+      <w:r>
+        <w:t xml:space="preserve">Relatório técnico · Estudo exploratório · Experimento OE-A · Versão 3.3</w:t>
       </w:r>
     </w:p>
     <w:bookmarkStart w:id="90" w:name="Xc3776bef04cdc8c08ee8a87d1f4d7a25866b5aa"/>
@@ -56,7 +56,7 @@
         <w:pStyle w:val="BodyText"/>
       </w:pPr>
       <w:r>
-        <w:t xml:space="preserve">Versão 3.2, 14 de julho de 2026 (campanhas exploratórias: 2, 8 a 10 e 13 de julho; reanálise: 12 de julho) · Dados e código: github.com/Joaoqueiroz-silva/sti-graph-validation (tag</w:t>
+        <w:t xml:space="preserve">Versão 3.3, 14 de julho de 2026 (campanhas exploratórias: 2, 8 a 10 e 13 de julho; reanálise: 12 de julho) · Dados e código: github.com/Joaoqueiroz-silva/sti-graph-validation (tag</w:t>
       </w:r>
       <w:r>
         <w:t xml:space="preserve"> </w:t>
@@ -608,7 +608,7 @@
         <w:t xml:space="preserve"> </w:t>
       </w:r>
       <w:r>
-        <w:t xml:space="preserve">grafo de conhecimento (esquerda) e grafo de comportamento (direita). No presente experimento, as habilidades entram como insumo, extraídas do próprio CTAT, e o objeto autorado e comparado é exclusivamente o grafo de comportamento.</w:t>
+        <w:t xml:space="preserve">grafo de conhecimento (esquerda) e grafo de comportamento (direita). No protocolo v1 (campanhas 1 e 2), as habilidades entravam como insumo, extraídas do próprio CTAT, e o objeto autorado e comparado é exclusivamente o grafo de comportamento.</w:t>
       </w:r>
     </w:p>
     <w:p>
@@ -785,13 +785,13 @@
           <w:bCs/>
           <w:b/>
         </w:rPr>
-        <w:t xml:space="preserve">QP2 (cobertura da referência):</w:t>
-      </w:r>
-      <w:r>
-        <w:t xml:space="preserve"> </w:t>
-      </w:r>
-      <w:r>
-        <w:t xml:space="preserve">que proporção dos valores de respostas erradas registrados no grafo CTAT de referência o sistema reproduz, e qual a concordância de classificação de respostas entre os dois grafos?</w:t>
+        <w:t xml:space="preserve">QP2 (conformidade com a referência):</w:t>
+      </w:r>
+      <w:r>
+        <w:t xml:space="preserve"> </w:t>
+      </w:r>
+      <w:r>
+        <w:t xml:space="preserve">em que medida o grafo gerado REPRODUZ O COMPORTAMENTO do grafo de referência: reconhece as ações de erro no estado correspondente (R_bug) e aceita e conclui os traços corretos (R_ok)? Secundariamente, que proporção dos VALORES de respostas erradas ele cobre (a métrica histórica das campanhas 1 e 2)?</w:t>
       </w:r>
     </w:p>
     <w:p>
@@ -1041,7 +1041,7 @@
         <w:t xml:space="preserve"> </w:t>
       </w:r>
       <w:r>
-        <w:t xml:space="preserve">que contém o grafo de referência (o parser percorre a estrutura para descobrir componentes e tipos), e o teste de vazamento é lexical, por lista de campos proibidos, não semântico. O protocolo garante, portanto,</w:t>
+        <w:t xml:space="preserve">que contém o grafo de referência (o parser percorre a estrutura para descobrir componentes e tipos), e o teste de vazamento é lexical, por lista de campos proibidos, não semântico. O protocolo v1 garantia, portanto,</w:t>
       </w:r>
       <w:r>
         <w:t xml:space="preserve"> </w:t>
@@ -1054,7 +1054,7 @@
         <w:t xml:space="preserve">blindagem parcial</w:t>
       </w:r>
       <w:r>
-        <w:t xml:space="preserve">, não independência total de fonte. A reconstrução do Envelope A a partir de fonte independente do grafo (o HTML e o DOM da interface, o screenshot e o gabarito do arquivo de produção em massa, todos disponíveis no corpus), acompanhada de teste metamórfico (mutações no grafo de referência não alteram um byte do envelope), FOI EXECUTADA: é o protocolo v2 da campanha 3 (Seções 3.11 e 4.11). A descrição acima documenta o protocolo v1, usado nas campanhas 1 e 2.</w:t>
+        <w:t xml:space="preserve">, não independência total de fonte; o protocolo v2 da campanha 3 eliminou a dependência (Seção 3.11). A reconstrução do Envelope A a partir de fonte independente do grafo (o HTML e o DOM da interface, o screenshot e o gabarito do arquivo de produção em massa, todos disponíveis no corpus), acompanhada de teste metamórfico (mutações no grafo de referência não alteram um byte do envelope), FOI EXECUTADA: é o protocolo v2 da campanha 3 (Seções 3.11 e 4.11). A descrição acima documenta o protocolo v1, usado nas campanhas 1 e 2.</w:t>
       </w:r>
     </w:p>
     <w:p>
@@ -1282,7 +1282,7 @@
         <w:t xml:space="preserve"> </w:t>
       </w:r>
       <w:r>
-        <w:t xml:space="preserve">(métrica primária, eixo X): fração dos valores de respostas erradas conceituais do grafo de referência cobertos pelo sistema. A operacionalização é declarada: uma misconception é representada pelo VALOR canônico da resposta errada, não pela regra cognitiva que a produz; dois raciocínios distintos que geram o mesmo valor contam como um item, e a mesma regra que gera valores diferentes em exercícios diferentes conta como itens distintos. A métrica mede, portanto, cobertura de valores do catálogo de referência (limitação discutida na Seção 6);</w:t>
+        <w:t xml:space="preserve">(métrica primária das campanhas 1 e 2; a partir da campanha 3, secundária histórica, com as coprimárias comportamentais R_bug e R_ok definidas no protocolo v2): fração dos valores de respostas erradas conceituais do grafo de referência cobertos pelo sistema. A operacionalização é declarada: uma misconception é representada pelo VALOR canônico da resposta errada, não pela regra cognitiva que a produz; dois raciocínios distintos que geram o mesmo valor contam como um item, e a mesma regra que gera valores diferentes em exercícios diferentes conta como itens distintos. A métrica mede, portanto, cobertura de valores do catálogo de referência (limitação discutida na Seção 6);</w:t>
       </w:r>
     </w:p>
     <w:p>
@@ -1472,7 +1472,7 @@
         <w:t xml:space="preserve"> </w:t>
       </w:r>
       <w:r>
-        <w:t xml:space="preserve">(completude conceitual, plausibilidade dos excedentes) constitui o desfecho primário do plano de análise (Seção 3.8). O par substitui o F1 como critério de mérito por um argumento de função de perda: em um instrumento generativo, o excedente não é defeito por definição, mas hipótese a verificar.</w:t>
+        <w:t xml:space="preserve">(completude conceitual, plausibilidade dos excedentes) constituiu o desfecho primário das campanhas 1 e 2; no protocolo v2 da campanha 3, os desfechos coprimários passam a ser comportamentais (Seções 3.11 e 4.11). O par substitui o F1 como critério de mérito por um argumento de função de perda: em um instrumento generativo, o excedente não é defeito por definição, mas hipótese a verificar.</w:t>
       </w:r>
     </w:p>
     <w:bookmarkEnd w:id="50"/>
@@ -1807,7 +1807,7 @@
         <w:t xml:space="preserve"> </w:t>
       </w:r>
       <w:r>
-        <w:t xml:space="preserve">Todos os números deste relatório são gerados pelo script</w:t>
+        <w:t xml:space="preserve">Todos os números deste relatório são gerados pelos scripts</w:t>
       </w:r>
       <w:r>
         <w:t xml:space="preserve"> </w:t>
@@ -1822,7 +1822,22 @@
         <w:t xml:space="preserve"> </w:t>
       </w:r>
       <w:r>
-        <w:t xml:space="preserve">a partir dos relatórios brutos, sem transcrição manual; a reconciliação formal com os números das versões 1.0 a 2.1 está em</w:t>
+        <w:t xml:space="preserve">(campanhas 1 e 2) e</w:t>
+      </w:r>
+      <w:r>
+        <w:t xml:space="preserve"> </w:t>
+      </w:r>
+      <w:r>
+        <w:rPr>
+          <w:rStyle w:val="VerbatimChar"/>
+        </w:rPr>
+        <w:t xml:space="preserve">analysis/reanalyze-c3.mjs</w:t>
+      </w:r>
+      <w:r>
+        <w:t xml:space="preserve"> </w:t>
+      </w:r>
+      <w:r>
+        <w:t xml:space="preserve">(campanha 3) a partir dos relatórios brutos, sem transcrição manual; a reconciliação formal com os números das versões 1.0 a 2.1 está em</w:t>
       </w:r>
       <w:r>
         <w:t xml:space="preserve"> </w:t>
@@ -1852,7 +1867,34 @@
         <w:t xml:space="preserve"> </w:t>
       </w:r>
       <w:r>
-        <w:t xml:space="preserve">Antes das campanhas, o desenho e o código passaram por duas rodadas de revisão independente com mandato explícito de refutação; as inconsistências (divergência de âncora entre módulos, infidelidade de temperatura) foram corrigidas e cobertas por testes de regressão. Após as campanhas, um parecer externo motivou a reanálise e o reposicionamento desta versão. A suíte do pacote de reprodução compreende 117 testes.</w:t>
+        <w:t xml:space="preserve">Antes das campanhas, o desenho e o código passaram por duas rodadas de revisão independente com mandato explícito de refutação; as inconsistências (divergência de âncora entre módulos, infidelidade de temperatura) foram corrigidas e cobertas por testes de regressão. Após as campanhas, um parecer externo motivou a reanálise e o reposicionamento desta versão. A suíte do pacote de reprodução compreende 226 testes em 23 arquivos. Os números das campanhas 1 e 2 são gerados por</w:t>
+      </w:r>
+      <w:r>
+        <w:t xml:space="preserve"> </w:t>
+      </w:r>
+      <w:r>
+        <w:rPr>
+          <w:rStyle w:val="VerbatimChar"/>
+        </w:rPr>
+        <w:t xml:space="preserve">analysis/reanalyze.mjs</w:t>
+      </w:r>
+      <w:r>
+        <w:t xml:space="preserve"> </w:t>
+      </w:r>
+      <w:r>
+        <w:t xml:space="preserve">e os da campanha 3 por</w:t>
+      </w:r>
+      <w:r>
+        <w:t xml:space="preserve"> </w:t>
+      </w:r>
+      <w:r>
+        <w:rPr>
+          <w:rStyle w:val="VerbatimChar"/>
+        </w:rPr>
+        <w:t xml:space="preserve">analysis/reanalyze-c3.mjs</w:t>
+      </w:r>
+      <w:r>
+        <w:t xml:space="preserve">; esta versão adiciona verificação automática de consistência entre o texto e os JSONs derivados.</w:t>
       </w:r>
     </w:p>
     <w:p>
@@ -1943,19 +1985,7 @@
         <w:pStyle w:val="FirstParagraph"/>
       </w:pPr>
       <w:r>
-        <w:t xml:space="preserve">A Tabela 1 especifica os modelos empregados em cada função, com as respectivas temperaturas, idênticos aos da plataforma em produção. As temperaturas diferem por função: a simulação do aluno avançado requer quase-determinismo; a do aluno com dificuldades requer diversidade para a emergência de erros; o julgamento requer estabilidade. O juiz pertence a família distinta da geradora (Seção 2.5). Todos os identificadores de modelo referem-se às versões servidas pela OpenRouter nas datas das campanhas e da bancada de juízes (2 e 8 a 10 de julho de 2026); provedores podem atualizar modelos sob o mesmo identificador, limitação padrão de estudos com APIs comerciais. O custo total de API foi de aproximadamente US$ 4 na campanha 1 e US$ 30 na campanha 2 (dominado pelos braços GLM-5.2 e Claude Sonnet 5); por grafo autorado, o custo marginal do sistema fica na ordem de US$ 0,05 e cerca de um minuto de máquina. Para referência do gargalo que motiva a automação, estimativas clássicas situam o desenvolvimento de tutores inteligentes em 200 a 300 horas por hora de instrução, razão que o paradigma example-tracing reduz substancialmente, mas não elimina (Aleven et al., 2009); o tempo do especialista deste corpus por grafo</w:t>
-      </w:r>
-      <w:r>
-        <w:t xml:space="preserve"> </w:t>
-      </w:r>
-      <w:r>
-        <w:t xml:space="preserve">[dado a coletar com o autor do corpus]</w:t>
-      </w:r>
-      <w:r>
-        <w:t xml:space="preserve"> </w:t>
-      </w:r>
-      <w:r>
-        <w:t xml:space="preserve">completará a comparação. Todos os modelos são acessados por um único provedor (OpenRouter), o que permite reprodução com uma única credencial; o pacote publicado inclui o comando</w:t>
+        <w:t xml:space="preserve">A Tabela 1 especifica os modelos empregados em cada função, com as respectivas temperaturas, idênticos aos da plataforma em produção. As temperaturas diferem por função: a simulação do aluno avançado requer quase-determinismo; a do aluno com dificuldades requer diversidade para a emergência de erros; o julgamento requer estabilidade. O juiz pertence a família distinta da geradora (Seção 2.5). Todos os identificadores de modelo referem-se às versões servidas pela OpenRouter nas datas das campanhas e da bancada de juízes (2 e 8 a 10 de julho de 2026); provedores podem atualizar modelos sob o mesmo identificador, limitação padrão de estudos com APIs comerciais. O custo total de API foi de aproximadamente US$ 4 na campanha 1 e US$ 30 na campanha 2 (dominado pelos braços GLM-5.2 e Claude Sonnet 5); por grafo autorado, o custo marginal do sistema fica na ordem de US$ 0,05 e cerca de um minuto de máquina. Para referência do gargalo que motiva a automação, estimativas clássicas situam o desenvolvimento de tutores inteligentes em 200 a 300 horas por hora de instrução, razão que o paradigma example-tracing reduz substancialmente, mas não elimina (Aleven et al., 2009). Todos os modelos são acessados por um único provedor (OpenRouter), o que permite reprodução com uma única credencial; o pacote publicado inclui o comando</w:t>
       </w:r>
       <w:r>
         <w:t xml:space="preserve"> </w:t>
@@ -2550,7 +2580,7 @@
         <w:pStyle w:val="FirstParagraph"/>
       </w:pPr>
       <w:r>
-        <w:t xml:space="preserve">A terceira campanha (13 de julho) estreia o protocolo v2, congelado integralmente ANTES de qualquer chamada (Emenda 4 do plano de análise): o Envelope A passa a ser construído de fonte independente do grafo de referência (o HTML da interface e o gabarito da tabela de produção em massa do CTAT, com teste metamórfico de independência), os KCs saem da entrada (só existiam dentro do grafo), o esquema neutro v2 representa estados e transições com um executor de example-tracing, e uma bateria congelada de 636 traços em três famílias substitui a bateria autorreferente. Duas consequências declaradas: os enunciados da fonte independente estão em inglês (os arquivos</w:t>
+        <w:t xml:space="preserve">A terceira campanha (13 de julho) estreia o protocolo v2, congelado antes das corridas analíticas (Emenda 4; um smoke test de 2 exercícios precedeu o congelamento final do executor, com registro no manifesto): o Envelope A passa a ser construído de fonte independente do grafo de referência (o HTML da interface e o gabarito da tabela de produção em massa do CTAT, com teste metamórfico de independência), os KCs saem da entrada (só existiam dentro do grafo), o esquema neutro v2 representa estados e transições com um executor de example-tracing, e uma bateria congelada de 636 traços em três famílias substitui a bateria autorreferente. Duas consequências declaradas: os enunciados da fonte independente estão em inglês (os arquivos</w:t>
       </w:r>
       <w:r>
         <w:t xml:space="preserve"> </w:t>
@@ -2916,7 +2946,7 @@
         <w:t xml:space="preserve"> </w:t>
       </w:r>
       <w:r>
-        <w:t xml:space="preserve">pela própria correção de acaso que o método promete, a concordância de classificação entre os dois grafos não excede o acaso. A matriz de confusão agregada (abaixo) explica o mecanismo: os dois lados concordam integralmente na resposta correta (72 de 72), o sistema cobre 91 dos 249 itens de erro da referência e adiciona 116 itens que a referência não registra; como a bateria é a união dos dois catálogos, a célula surpresa×surpresa é impossível por construção, não há verdadeiros negativos e o κ é estruturalmente deprimido. O achado desautoriza o uso do termo "equivalência funcional" para o instrumento atual e motivou a bateria independente de traços da campanha 3 (com verdadeiros negativos por construção; o κ comportamental medido sob o instrumento corrigido, 0,037, confirma o diagnóstico).</w:t>
+        <w:t xml:space="preserve">pela própria correção de acaso que o método promete, a concordância de classificação entre os dois grafos não excede o acaso. A matriz de confusão agregada (abaixo) explica o mecanismo: os dois lados concordam integralmente na resposta correta (72 de 72), o sistema cobre 91 dos 249 itens de erro da referência e adiciona 116 itens que a referência não registra; como a bateria é a união dos dois catálogos, a célula surpresa×surpresa é impossível por construção, não há verdadeiros negativos e o κ é estruturalmente deprimido. O achado desautoriza o uso do termo "equivalência funcional" para o instrumento atual e motivou a bateria independente de traços da campanha 3 (com verdadeiros negativos por construção; o κ comportamental sob o instrumento corrigido, 0,037 tanto na média macro por exercício quanto no agrupado da matriz somada, confirma baixa concordância comportamental; a bateria antiga LIMITAVA a interpretação, a nova a confirma).</w:t>
       </w:r>
     </w:p>
     <w:p>
@@ -6018,13 +6048,13 @@
       </w:r>
     </w:p>
     <w:bookmarkEnd w:id="79"/>
-    <w:bookmarkStart w:id="80" w:name="X7e5a29d608242e9eb1cf239be9a8ebd6d307583"/>
+    <w:bookmarkStart w:id="80" w:name="Xcec15460c4154d8102a28e00c3ea5a90a31e617"/>
     <w:p>
       <w:pPr>
         <w:pStyle w:val="Heading3"/>
       </w:pPr>
       <w:r>
-        <w:t xml:space="preserve">4.11 Campanha 3: o vazamento quantificado e o freio do prompt</w:t>
+        <w:t xml:space="preserve">4.11 Campanha 3: contraste entre os protocolos v1 e v2 e ablação do limite de candidatos</w:t>
       </w:r>
     </w:p>
     <w:p>
@@ -6045,7 +6075,7 @@
         <w:t xml:space="preserve">0,243 [0,163; 0,324]</w:t>
       </w:r>
       <w:r>
-        <w:t xml:space="preserve">. A anatomia por tipo de erro localiza a diferença: a previsão de frações incorretas não mudou (39% nas duas condições de entrada), enquanto a de valores isolados desabou (numerador de 50% para 24%; outros inteiros de 73% para 0%). Uma causa plausível e localizada é a remoção dos KCs da entrada, que eram extraídos das regras de produção do grafo (nomes como</w:t>
+        <w:t xml:space="preserve">. A anatomia por tipo de erro localiza a diferença: a previsão de frações incorretas ficou praticamente inalterada (39% no protocolo anterior; 40% no v2), enquanto a de valores isolados desabou (numerador de 50% para 24%; outros inteiros de 73% para 0%). Uma causa plausível e localizada é a remoção dos KCs da entrada, que eram extraídos das regras de produção do grafo (nomes como</w:t>
       </w:r>
       <w:r>
         <w:t xml:space="preserve"> </w:t>
@@ -6103,7 +6133,7 @@
         <w:t xml:space="preserve">a conformidade comportamental do grafo gerado com o grafo de referência é baixa</w:t>
       </w:r>
       <w:r>
-        <w:t xml:space="preserve">. No baseline, R_bug=0,065 [0,020; 0,113] e R_ok=0 (nenhum traço correto completo da referência é aceito passo a passo, em NENHUM dos nove braços); o κ da bateria independente, agora com verdadeiros negativos, fica em 0,037 [0,034; 0,039]. A anatomia item a item atribui o resultado à distância de granularidade e de ordem entre os ~4 passos conceituais do grafo gerado e os ~8 micropassos de interface da referência: mesmo cobrindo valores de erro, o grafo gerado não conduz um aluno que segue o caminho da referência até o fim, nem reconhece o erro NO passo em que a referência o espera. Cobertura de valores, o desfecho histórico, mede outra coisa e fica registrada como secundária.</w:t>
+        <w:t xml:space="preserve">. No baseline, R_bug=0,065 [0,020; 0,113] e R_ok=0 (nenhum traço correto completo da referência é aceito passo a passo, em NENHUM dos nove braços); o κ da bateria independente, agora com verdadeiros negativos, fica em 0,037 [0,034; 0,039]. A anatomia item a item atribui o resultado à distância de granularidade e de ordem entre os ~4 passos conceituais do grafo gerado e os ~8 micropassos de interface da referência: mesmo cobrindo valores de erro, o grafo gerado raramente reconhece o erro NO passo em que a referência o espera, e nenhum traço correto é aceito integralmente passo a passo. A análise exploratória de sensibilidade com o critério LENIENTE (rOkCompleted: o traço chega ao estado final mesmo com micropassos não reconhecidos) nuança sem inverter o quadro: 0,069 [0; 0,167] no baseline, 0,125 na condição de seis candidatos e 0,292 [0,125; 0,472] na condição DOM, contra zero na chamada única; ou seja, uma fração dos traços TERMINA, mas a conformidade passo a passo permanece nula em todos os braços. Cobertura de valores, o desfecho histórico, mede outra coisa e fica registrada como secundária.</w:t>
       </w:r>
     </w:p>
     <w:p>
@@ -6485,7 +6515,7 @@
         <w:t xml:space="preserve"> </w:t>
       </w:r>
       <w:r>
-        <w:t xml:space="preserve">campanha 3 (protocolo v2), completude conceitual por condição (média por exercício, IC95%; 3 réplicas; zero falha de autoria). Testes pareados contra o baseline por permutação exata; Holm por família declarada (ablações: m=6).</w:t>
+        <w:t xml:space="preserve">campanha 3 (protocolo v2), completude conceitual por condição (média por exercício, IC95%; 3 réplicas; zero falha de autoria). Testes pareados contra o baseline por permutação exata; Holm por família: ablações = família F2 congelada (m=6, p-Holm exatos); braços de modelo em cobertura = família F4 POST-HOC (m=2), declarada como exploratória porque as famílias congeladas testam braços apenas nos desfechos comportamentais.</w:t>
       </w:r>
     </w:p>
     <w:tbl>
@@ -6575,7 +6605,7 @@
               <w:jc w:val="left"/>
             </w:pPr>
             <w:r>
-              <w:t xml:space="preserve">0,243 [0,196; 0,290]</w:t>
+              <w:t xml:space="preserve">0,243 [0,163; 0,324]</w:t>
             </w:r>
           </w:p>
         </w:tc>
@@ -6649,7 +6679,7 @@
               <w:jc w:val="left"/>
             </w:pPr>
             <w:r>
-              <w:t xml:space="preserve">n.s.</w:t>
+              <w:t xml:space="preserve">0,095 (post-hoc, F4)</w:t>
             </w:r>
           </w:p>
         </w:tc>
@@ -6699,7 +6729,7 @@
               <w:jc w:val="left"/>
             </w:pPr>
             <w:r>
-              <w:t xml:space="preserve">n.s.</w:t>
+              <w:t xml:space="preserve">0,170 (post-hoc, F4)</w:t>
             </w:r>
           </w:p>
         </w:tc>
@@ -6815,7 +6845,7 @@
               <w:jc w:val="left"/>
             </w:pPr>
             <w:r>
-              <w:t xml:space="preserve">n.s.</w:t>
+              <w:t xml:space="preserve">1,000</w:t>
             </w:r>
           </w:p>
         </w:tc>
@@ -6865,7 +6895,7 @@
               <w:jc w:val="left"/>
             </w:pPr>
             <w:r>
-              <w:t xml:space="preserve">n.s.</w:t>
+              <w:t xml:space="preserve">1,000</w:t>
             </w:r>
           </w:p>
         </w:tc>
@@ -6915,7 +6945,7 @@
               <w:jc w:val="left"/>
             </w:pPr>
             <w:r>
-              <w:t xml:space="preserve">n.s.</w:t>
+              <w:t xml:space="preserve">0,938</w:t>
             </w:r>
           </w:p>
         </w:tc>
@@ -6965,7 +6995,7 @@
               <w:jc w:val="left"/>
             </w:pPr>
             <w:r>
-              <w:t xml:space="preserve">n.s.</w:t>
+              <w:t xml:space="preserve">1,000</w:t>
             </w:r>
           </w:p>
         </w:tc>
@@ -7015,7 +7045,7 @@
               <w:jc w:val="left"/>
             </w:pPr>
             <w:r>
-              <w:t xml:space="preserve">n.s.</w:t>
+              <w:t xml:space="preserve">1,000</w:t>
             </w:r>
           </w:p>
         </w:tc>
@@ -7034,7 +7064,7 @@
         <w:pStyle w:val="BodyText"/>
       </w:pPr>
       <w:r>
-        <w:t xml:space="preserve">A curva de ensemble sobre o envelope independente reproduz o mecanismo de amostragem: 24% em K=1, 35% em K=3, 42% em K=6 e 47% em K=10, ainda crescente. Combinada ao efeito do limite (0,42 com uma única execução de alvo 6), a engenharia de recuperação de cobertura fica quantificada em duas alavancas independentes e baratas. As métricas comportamentais (bateria congelada, executor de traços) confirmaram o quadro entre braços (nenhuma diferença entre famílias de modelo; p-Holm≥0,44) e expuseram com honestidade a distância de granularidade entre o grafo gerado e o de referência: no nível de correspondência declarado, o reconhecimento de erros em contexto fica em 0,06 e nenhum traço correto completo da referência é aceito passo a passo, anatomia registrada item a item nos relatórios.</w:t>
+        <w:t xml:space="preserve">A curva de ensemble sobre o envelope independente reproduz o mecanismo de amostragem: 24% em K=1, 35% em K=3, 42% em K=6 e 47% em K=10, ainda crescente. Combinada ao efeito do limite (0,42 com uma única execução de alvo 6), a engenharia de recuperação de cobertura fica quantificada em duas estratégias baratas, ambas baseadas em aumentar a quantidade de candidatos (e por isso não independentes entre si). As métricas comportamentais (bateria congelada, executor de traços) confirmaram o quadro entre braços (nenhuma diferença entre famílias de modelo; p-Holm≥0,44) e expuseram com honestidade a distância de granularidade entre o grafo gerado e o de referência: no nível de correspondência declarado, o reconhecimento de erros em contexto fica em 0,06 e nenhum traço correto completo da referência é aceito passo a passo, anatomia registrada item a item nos relatórios.</w:t>
       </w:r>
     </w:p>
     <w:p>
@@ -7145,7 +7175,7 @@
         <w:pStyle w:val="BodyText"/>
       </w:pPr>
       <w:r>
-        <w:t xml:space="preserve">A campanha 3 reordena a leitura do estudo. O resultado central é comportamental e é baixo: o grafo gerado cobre parte dos VALORES de erro da referência, mas não reproduz o COMPORTAMENTO dela (R_ok=0; R_bug=0,065), sobretudo por granularidade e ordem dos passos. Sobre as suspeitas da revisão externa: o contraste entre protocolos (13,3 pontos de cobertura) é compatível com vazamento pela entrada antiga, com os KCs como explicação mais plausível pela anatomia por categoria, mas fonte, KCs e idioma mudaram juntos e a atribuição causal exata fica para a ablação futura; a dependência do catálogo interno não foi detectada (e ele estava inerte nas campanhas anteriores); o alvo numérico do prompt é a única alavanca de cobertura confirmada (+17,7 pontos, sob maior orçamento de saída e sem ganho coprimário detectável); e a representação visual não moveu cobertura, mas aumentou a concordância comportamental, resultado misto que mantém a hipótese de affordance viva no plano do comportamento. O caminho de engenharia continua barato e mensurável, agora com a régua certa: qualquer melhoria futura deve ser cobrada nos desfechos coprimários, não apenas na cobertura por valor.</w:t>
+        <w:t xml:space="preserve">A campanha 3 reordena a leitura do estudo. O resultado central é comportamental e é baixo: o grafo gerado cobre parte dos VALORES de erro da referência, mas não reproduz o COMPORTAMENTO dela (R_ok=0; R_bug=0,065), sobretudo por granularidade e ordem dos passos. Sobre as suspeitas da revisão externa: o contraste entre protocolos (13,3 pontos de cobertura) é compatível com vazamento pela entrada antiga, com os KCs como explicação mais plausível pela anatomia por categoria, mas fonte, KCs e idioma mudaram juntos e a atribuição causal exata fica para a ablação futura; a dependência do catálogo interno não foi detectada (e ele estava inerte nas campanhas anteriores); a condição limite-6 é a única com diferença de cobertura detectada (+17,7 pontos; o efeito pertence à condição, que combina instrução numérica e maior orçamento de saída, sem ganho coprimário detectável); e a representação visual não moveu cobertura, mas aumentou a concordância comportamental, resultado misto que mantém a hipótese de affordance viva no plano do comportamento. O caminho de engenharia continua barato e mensurável, agora com a régua certa: qualquer melhoria futura deve ser cobrada nos desfechos coprimários, não apenas na cobertura por valor.</w:t>
       </w:r>
     </w:p>
     <w:p>
@@ -7211,7 +7241,7 @@
         <w:t xml:space="preserve"> </w:t>
       </w:r>
       <w:r>
-        <w:t xml:space="preserve">O protocolo de envelopes é verificado mecanicamente e o teste de vazamento inclui controle negativo, mas a blindagem é PARCIAL: o Envelope A deriva do mesmo arquivo que contém o grafo de referência e o teste é lexical (Seção 3.3). Há ainda assimetria informacional entre as condições: o autor da referência via a interface real, enquanto os agentes recebem uma serialização textual dela, o que pode explicar parte do ponto cego pragmático (Seção 4.10). A resposta correta no Envelope A é decisão declarada de desenho. As réplicas e os intervalos reportados absorvem a estocasticidade dos agentes; falhas de chamada e acionamentos de contingência não foram registrados nas campanhas 1 e 2; a campanha 3 corrigiu a lacuna com manifesto por chamada (zero falha de autoria em 648 execuções).</w:t>
+        <w:t xml:space="preserve">O protocolo de envelopes é verificado mecanicamente e o teste de vazamento inclui controle negativo, mas no protocolo v1 a blindagem era PARCIAL (Envelope A derivado do mesmo arquivo, teste lexical; Seção 3.3); o protocolo v2 tem independência de fonte com teste metamórfico, e o resultado principal repousa nele. Há ainda assimetria informacional entre as condições: o autor da referência via a interface real, enquanto os agentes recebem uma serialização textual dela, o que pode explicar parte do ponto cego pragmático (Seção 4.10). A resposta correta no Envelope A é decisão declarada de desenho. As réplicas e os intervalos reportados absorvem a estocasticidade dos agentes; falhas de chamada e acionamentos de contingência não foram registrados nas campanhas 1 e 2; a campanha 3 corrigiu a lacuna com manifesto por chamada (zero falha de autoria em 648 execuções).</w:t>
       </w:r>
     </w:p>
     <w:p>
@@ -7357,13 +7387,13 @@
           <w:bCs/>
           <w:b/>
         </w:rPr>
-        <w:t xml:space="preserve">EXECUTADO (campanha 3):</w:t>
-      </w:r>
-      <w:r>
-        <w:t xml:space="preserve"> </w:t>
-      </w:r>
-      <w:r>
-        <w:t xml:space="preserve">Envelope A independente com teste metamórfico, esquema v2 com executor de traços, bateria independente congelada e mutation testing do verificador. Permanecem futuras: a execução dos grafos no runtime real do CTAT e a ablação que isole os fatores confundidos do contraste entre protocolos (KCs, idioma e fonte da entrada).</w:t>
+        <w:t xml:space="preserve">Runtime real e desconfusão do contraste:</w:t>
+      </w:r>
+      <w:r>
+        <w:t xml:space="preserve"> </w:t>
+      </w:r>
+      <w:r>
+        <w:t xml:space="preserve">executar os grafos no runtime do CTAT e realizar a ablação que isole os fatores confundidos entre os protocolos v1 e v2 (KCs, idioma e fonte da entrada).</w:t>
       </w:r>
     </w:p>
     <w:p>
@@ -7379,13 +7409,13 @@
           <w:bCs/>
           <w:b/>
         </w:rPr>
-        <w:t xml:space="preserve">EXECUTADAS (campanha 3):</w:t>
-      </w:r>
-      <w:r>
-        <w:t xml:space="preserve"> </w:t>
-      </w:r>
-      <w:r>
-        <w:t xml:space="preserve">as ablações de catálogo, limite, saturação, DOM, screenshot e chamada única, e o painel de três famílias de juízes. Permanecem futuras: KCs presentes contra ausentes (isolamento do confundidor) e baselines sem LLM com o mesmo orçamento de candidatos.</w:t>
+        <w:t xml:space="preserve">Baselines sem LLM e ablação de KCs:</w:t>
+      </w:r>
+      <w:r>
+        <w:t xml:space="preserve"> </w:t>
+      </w:r>
+      <w:r>
+        <w:t xml:space="preserve">amostragem do catálogo com o mesmo orçamento de candidatos, e KCs presentes contra ausentes, completando o programa de ablações iniciado na campanha 3.</w:t>
       </w:r>
     </w:p>
     <w:p>
@@ -7425,15 +7455,15 @@
         <w:pStyle w:val="FirstParagraph"/>
       </w:pPr>
       <w:r>
-        <w:t xml:space="preserve">Neste corpus de 24 exercícios derivados de um único template, o sistema cobriu 37,6% (IC95% de 0,309 a 0,442) dos valores canônicos de respostas erradas presentes no catálogo de um especialista de referência, taxa que a união de três execuções eleva a 64% e que nenhuma troca de modelo, entre quatro famílias testadas, alterou de forma detectável. A montagem determinística não apresentou violação das invariantes estruturais implementadas, em 72 grafos de campanha e 10.000 grafos de teste. Um modelo-juiz cego classificou 83% dos erros excedentes como plausíveis, com taxas sensíveis à identidade do juiz e ainda não calibradas contra avaliadores humanos. A concordância de classificação de respostas corrigida pelo acaso ficou próxima de zero, resultado negativo que expõe a limitação da bateria autorreferente e motiva a bateria independente de traços. A anatomia das omissões identifica uma classe dominante e acionável (a resposta composta apenas pelo denominador), com duas explicações candidatas separáveis por ablação (lacuna de simulação pragmática ou assimetria informacional da entrada textual).</w:t>
-      </w:r>
-    </w:p>
-    <w:p>
-      <w:pPr>
-        <w:pStyle w:val="BodyText"/>
-      </w:pPr>
-      <w:r>
-        <w:t xml:space="preserve">O que este estudo NÃO estabelece, por desenho: a qualidade do grafo completo (dicas, remediações e múltiplos caminhos não são comparados), a equivalência funcional entre tutores, a não inferioridade em relação a especialistas (não estimável sem banda humano-humano), a validade pedagógica dos excedentes e qualquer efeito sobre aprendizagem. Esses níveis exigem, respectivamente, a comparação baseada em traços sobre o esquema ampliado, a bateria independente, a coleta com múltiplos especialistas, a anotação humana e o estudo com estudantes, todos especificados como fases futuras. Os resultados atuais são compatíveis, no domínio e no template estudados, com o uso do sistema como FERRAMENTA DE APOIO à autoria, com revisão humana, e não como substituto do especialista. A campanha 3, sob protocolo integralmente congelado antes da execução e entrada independente do grafo de referência, mediu pela primeira vez os desfechos coprimários comportamentais e entregou o resultado central do estudo: a conformidade comportamental é baixa (R_bug=0,065; R_ok=0), com anatomia identificada na granularidade e na ordem dos passos. A cobertura por valor sob o protocolo v2 é 0,243 (13,3 pontos abaixo do protocolo anterior, contraste que não isola causa); o alvo numérico do prompt é a única alavanca de cobertura que sobrevive à correção (+17,7 pontos, sob maior orçamento de saída e sem ganho coprimário detectável); a representação com screenshot aumentou a concordância comportamental; e o painel de três famílias de juízes apresentou concordância de moderada a substancial. O experimento completo, com corpus, dados brutos congelados das três campanhas, manifestos de execução com custo por chamada, reanálises verificadas em sala limpa, código e documentação, está publicado para reprodução e extensão independentes.</w:t>
+        <w:t xml:space="preserve">O resultado central deste estudo é comportamental: sob o protocolo v2, com entrada independente do grafo de referência, a conformidade do grafo gerado com o comportamento da referência é baixa (reconhecimento de erros em contexto de 0,065; nenhum traço correto aceito integralmente passo a passo; no critério leniente, no máximo 29% dos traços chegam ao fim, na condição DOM). Nas métricas de VALOR, neste corpus de 24 exercícios derivados de um único template, o sistema cobriu 37,6% (IC95% de 0,309 a 0,442) dos valores canônicos de respostas erradas presentes no catálogo de um especialista de referência, taxa que a união de três execuções eleva a 64% e que nenhuma troca de modelo, entre quatro famílias testadas, alterou de forma detectável. A montagem determinística não apresentou violação das invariantes estruturais implementadas, em 72 grafos de campanha e 10.000 grafos de teste. Um modelo-juiz cego classificou 83% dos erros excedentes como plausíveis, com taxas sensíveis à identidade do juiz e ainda não calibradas contra avaliadores humanos. A concordância de classificação de respostas corrigida pelo acaso ficou próxima de zero, resultado negativo que expõe a limitação da bateria autorreferente e motiva a bateria independente de traços. A anatomia das omissões identifica uma classe dominante e acionável (a resposta composta apenas pelo denominador), com duas explicações candidatas separáveis por ablação (lacuna de simulação pragmática ou assimetria informacional da entrada textual).</w:t>
+      </w:r>
+    </w:p>
+    <w:p>
+      <w:pPr>
+        <w:pStyle w:val="BodyText"/>
+      </w:pPr>
+      <w:r>
+        <w:t xml:space="preserve">O que este estudo NÃO estabelece, por desenho: a qualidade do grafo completo (dicas, remediações e múltiplos caminhos não são comparados), a equivalência funcional entre tutores, a não inferioridade em relação a especialistas (não estimável sem banda humano-humano), a validade pedagógica dos excedentes e qualquer efeito sobre aprendizagem. Esses níveis exigem, respectivamente, a comparação baseada em traços sobre o esquema ampliado, a bateria independente, a coleta com múltiplos especialistas, a anotação humana e o estudo com estudantes, todos especificados como fases futuras. Os resultados atuais são compatíveis, no domínio e no template estudados, com o uso do sistema como FERRAMENTA DE APOIO à autoria, com revisão humana, e não como substituto do especialista. A campanha 3, sob protocolo integralmente congelado antes da execução e entrada independente do grafo de referência, mediu pela primeira vez os desfechos coprimários comportamentais e entregou o resultado central do estudo: a conformidade comportamental é baixa (R_bug=0,065; R_ok=0), com anatomia identificada na granularidade e na ordem dos passos. A cobertura por valor sob o protocolo v2 é 0,243 (13,3 pontos abaixo do protocolo anterior, contraste que não isola causa); a condição de seis candidatos é a única com diferença de cobertura que sobrevive à correção (+17,7 pontos; instrução numérica e orçamento de saída confundidos na mesma condição, sem ganho coprimário detectável); a representação com screenshot aumentou a concordância comportamental; e o painel de três famílias de juízes apresentou concordância de moderada a substancial. O experimento completo, com corpus, dados brutos congelados das três campanhas, manifestos de execução com custo por chamada, reanálises verificadas em sala limpa, código e documentação, está publicado para reprodução e extensão independentes.</w:t>
       </w:r>
     </w:p>
     <w:bookmarkEnd w:id="85"/>
@@ -7730,7 +7760,7 @@
         <w:pStyle w:val="BodyText"/>
       </w:pPr>
       <w:r>
-        <w:t xml:space="preserve">GUPTA, K. D.; HAQUE, M. A.; ALI, H.; KAMAL, M.; ALAM, S. B.; RAHMAN, M. A. Continuous monitoring of large-scale generative AI via deterministic knowledge graph structures.</w:t>
+        <w:t xml:space="preserve">CEN, H.; KOEDINGER, K. R.; JUNKER, B. Learning Factors Analysis: a general method for cognitive model evaluation and improvement. In:</w:t>
       </w:r>
       <w:r>
         <w:t xml:space="preserve"> </w:t>
@@ -7740,21 +7770,18 @@
           <w:iCs/>
           <w:i/>
         </w:rPr>
-        <w:t xml:space="preserve">arXiv preprint</w:t>
-      </w:r>
-      <w:r>
-        <w:t xml:space="preserve"> </w:t>
-      </w:r>
-      <w:r>
-        <w:t xml:space="preserve">arXiv:2509.03857, 2025.</w:t>
-      </w:r>
-    </w:p>
-    <w:p>
-      <w:pPr>
-        <w:pStyle w:val="BodyText"/>
-      </w:pPr>
-      <w:r>
-        <w:t xml:space="preserve">CEN, H.; KOEDINGER, K. R.; JUNKER, B. Learning Factors Analysis: a general method for cognitive model evaluation and improvement. In:</w:t>
+        <w:t xml:space="preserve">Intelligent Tutoring Systems</w:t>
+      </w:r>
+      <w:r>
+        <w:t xml:space="preserve">. Berlin: Springer, 2006.</w:t>
+      </w:r>
+    </w:p>
+    <w:p>
+      <w:pPr>
+        <w:pStyle w:val="BodyText"/>
+      </w:pPr>
+      <w:r>
+        <w:t xml:space="preserve">GUPTA, K. D.; HAQUE, M. A.; ALI, H.; KAMAL, M.; ALAM, S. B.; RAHMAN, M. A. Continuous monitoring of large-scale generative AI via deterministic knowledge graph structures.</w:t>
       </w:r>
       <w:r>
         <w:t xml:space="preserve"> </w:t>
@@ -7764,10 +7791,13 @@
           <w:iCs/>
           <w:i/>
         </w:rPr>
-        <w:t xml:space="preserve">Intelligent Tutoring Systems</w:t>
-      </w:r>
-      <w:r>
-        <w:t xml:space="preserve">. Berlin: Springer, 2006.</w:t>
+        <w:t xml:space="preserve">arXiv preprint</w:t>
+      </w:r>
+      <w:r>
+        <w:t xml:space="preserve"> </w:t>
+      </w:r>
+      <w:r>
+        <w:t xml:space="preserve">arXiv:2509.03857, 2025.</w:t>
       </w:r>
     </w:p>
     <w:p>
@@ -8109,13 +8139,13 @@
         <w:pStyle w:val="FirstParagraph"/>
       </w:pPr>
       <w:r>
-        <w:t xml:space="preserve">Relatório técnico do Experimento OE-A · EducaOFF / STI Unplugged · versão 3.2 (estudo exploratório), 14 de julho de 2026.</w:t>
+        <w:t xml:space="preserve">Relatório técnico do Experimento OE-A · EducaOFF / STI Unplugged · versão 3.3 (estudo exploratório), 14 de julho de 2026.</w:t>
       </w:r>
       <w:r>
         <w:br/>
       </w:r>
       <w:r>
-        <w:t xml:space="preserve">Dados brutos das duas campanhas versionados em</w:t>
+        <w:t xml:space="preserve">Dados brutos das três campanhas versionados em</w:t>
       </w:r>
       <w:r>
         <w:t xml:space="preserve"> </w:t>

</xml_diff>